<commit_message>
docs: simplifica o diagrama de classes para as entidades do banco
O diagrama anterior desenhava a aplicação inteira — controladores, serviços,
repositórios e DTOs — e ficou difícil de ler. Agora mostra só o que o título
promete: User, Book e o enum Role, com uma tabela ligando cada classe à sua
tabela e às restrições que valem nela.
</commit_message>
<xml_diff>
--- a/docs/arquitetura.docx
+++ b/docs/arquitetura.docx
@@ -2809,13 +2809,21 @@
       </w:r>
     </w:p>
     <w:p>
+      <w:r>
+        <w:rPr>
+          <w:b w:val="0"/>
+        </w:rPr>
+        <w:t>As duas entidades do banco, com o enum do papel do usuário. Cada classe corresponde a uma tabela criada pelas migrações do Flyway.</w:t>
+      </w:r>
+    </w:p>
+    <w:p>
       <w:pPr>
         <w:jc w:val="center"/>
       </w:pPr>
       <w:r>
         <w:drawing>
           <wp:inline xmlns:a="http://schemas.openxmlformats.org/drawingml/2006/main" xmlns:pic="http://schemas.openxmlformats.org/drawingml/2006/picture">
-            <wp:extent cx="5943600" cy="3813810"/>
+            <wp:extent cx="5943600" cy="8006549"/>
             <wp:docPr id="1" name="Picture 1"/>
             <wp:cNvGraphicFramePr>
               <a:graphicFrameLocks noChangeAspect="1"/>
@@ -2836,7 +2844,7 @@
                   <pic:spPr>
                     <a:xfrm>
                       <a:off x="0" y="0"/>
-                      <a:ext cx="5943600" cy="3813810"/>
+                      <a:ext cx="5943600" cy="8006549"/>
                     </a:xfrm>
                     <a:prstGeom prst="rect"/>
                   </pic:spPr>
@@ -2857,6 +2865,342 @@
           <w:sz w:val="18"/>
         </w:rPr>
         <w:t>Diagrama de classes do back-end</w:t>
+      </w:r>
+    </w:p>
+    <w:tbl>
+      <w:tblPr>
+        <w:tblStyle w:val="LightGrid-Accent1"/>
+        <w:tblW w:type="auto" w:w="0"/>
+        <w:jc w:val="center"/>
+        <w:tblLook w:firstColumn="1" w:firstRow="1" w:lastColumn="0" w:lastRow="0" w:noHBand="0" w:noVBand="1" w:val="04A0"/>
+      </w:tblPr>
+      <w:tblGrid>
+        <w:gridCol w:w="2880"/>
+        <w:gridCol w:w="2880"/>
+        <w:gridCol w:w="2880"/>
+      </w:tblGrid>
+      <w:tr>
+        <w:tc>
+          <w:tcPr>
+            <w:tcW w:type="dxa" w:w="2880"/>
+          </w:tcPr>
+          <w:p>
+            <w:pPr>
+              <w:spacing w:after="40"/>
+            </w:pPr>
+            <w:r>
+              <w:rPr>
+                <w:sz w:val="19"/>
+              </w:rPr>
+            </w:r>
+            <w:r>
+              <w:rPr>
+                <w:b/>
+                <w:sz w:val="19"/>
+              </w:rPr>
+              <w:t>Classe</w:t>
+            </w:r>
+          </w:p>
+        </w:tc>
+        <w:tc>
+          <w:tcPr>
+            <w:tcW w:type="dxa" w:w="2880"/>
+          </w:tcPr>
+          <w:p>
+            <w:pPr>
+              <w:spacing w:after="40"/>
+            </w:pPr>
+            <w:r>
+              <w:rPr>
+                <w:sz w:val="19"/>
+              </w:rPr>
+            </w:r>
+            <w:r>
+              <w:rPr>
+                <w:b/>
+                <w:sz w:val="19"/>
+              </w:rPr>
+              <w:t>Tabela</w:t>
+            </w:r>
+          </w:p>
+        </w:tc>
+        <w:tc>
+          <w:tcPr>
+            <w:tcW w:type="dxa" w:w="2880"/>
+          </w:tcPr>
+          <w:p>
+            <w:pPr>
+              <w:spacing w:after="40"/>
+            </w:pPr>
+            <w:r>
+              <w:rPr>
+                <w:sz w:val="19"/>
+              </w:rPr>
+            </w:r>
+            <w:r>
+              <w:rPr>
+                <w:b/>
+                <w:sz w:val="19"/>
+              </w:rPr>
+              <w:t>Observações</w:t>
+            </w:r>
+          </w:p>
+        </w:tc>
+      </w:tr>
+      <w:tr>
+        <w:tc>
+          <w:tcPr>
+            <w:tcW w:type="dxa" w:w="2880"/>
+          </w:tcPr>
+          <w:p>
+            <w:pPr>
+              <w:spacing w:after="40"/>
+            </w:pPr>
+            <w:r>
+              <w:rPr>
+                <w:sz w:val="19"/>
+              </w:rPr>
+            </w:r>
+            <w:r>
+              <w:rPr>
+                <w:rFonts w:ascii="Consolas" w:hAnsi="Consolas"/>
+                <w:b w:val="0"/>
+                <w:sz w:val="19"/>
+              </w:rPr>
+              <w:t>User</w:t>
+            </w:r>
+          </w:p>
+        </w:tc>
+        <w:tc>
+          <w:tcPr>
+            <w:tcW w:type="dxa" w:w="2880"/>
+          </w:tcPr>
+          <w:p>
+            <w:pPr>
+              <w:spacing w:after="40"/>
+            </w:pPr>
+            <w:r>
+              <w:rPr>
+                <w:sz w:val="19"/>
+              </w:rPr>
+            </w:r>
+            <w:r>
+              <w:rPr>
+                <w:rFonts w:ascii="Consolas" w:hAnsi="Consolas"/>
+                <w:b w:val="0"/>
+                <w:sz w:val="19"/>
+              </w:rPr>
+              <w:t>users</w:t>
+            </w:r>
+          </w:p>
+        </w:tc>
+        <w:tc>
+          <w:tcPr>
+            <w:tcW w:type="dxa" w:w="2880"/>
+          </w:tcPr>
+          <w:p>
+            <w:pPr>
+              <w:spacing w:after="40"/>
+            </w:pPr>
+            <w:r>
+              <w:rPr>
+                <w:sz w:val="19"/>
+              </w:rPr>
+            </w:r>
+            <w:r>
+              <w:rPr>
+                <w:rFonts w:ascii="Consolas" w:hAnsi="Consolas"/>
+                <w:b w:val="0"/>
+                <w:sz w:val="19"/>
+              </w:rPr>
+              <w:t>email</w:t>
+            </w:r>
+            <w:r>
+              <w:rPr>
+                <w:b w:val="0"/>
+                <w:sz w:val="19"/>
+              </w:rPr>
+              <w:t xml:space="preserve"> é único; </w:t>
+            </w:r>
+            <w:r>
+              <w:rPr>
+                <w:rFonts w:ascii="Consolas" w:hAnsi="Consolas"/>
+                <w:b w:val="0"/>
+                <w:sz w:val="19"/>
+              </w:rPr>
+              <w:t>password</w:t>
+            </w:r>
+            <w:r>
+              <w:rPr>
+                <w:b w:val="0"/>
+                <w:sz w:val="19"/>
+              </w:rPr>
+              <w:t xml:space="preserve"> guarda o hash BCrypt; </w:t>
+            </w:r>
+            <w:r>
+              <w:rPr>
+                <w:rFonts w:ascii="Consolas" w:hAnsi="Consolas"/>
+                <w:b w:val="0"/>
+                <w:sz w:val="19"/>
+              </w:rPr>
+              <w:t>role</w:t>
+            </w:r>
+            <w:r>
+              <w:rPr>
+                <w:b w:val="0"/>
+                <w:sz w:val="19"/>
+              </w:rPr>
+              <w:t xml:space="preserve"> é gravado como texto (</w:t>
+            </w:r>
+            <w:r>
+              <w:rPr>
+                <w:rFonts w:ascii="Consolas" w:hAnsi="Consolas"/>
+                <w:b w:val="0"/>
+                <w:sz w:val="19"/>
+              </w:rPr>
+              <w:t>USER</w:t>
+            </w:r>
+            <w:r>
+              <w:rPr>
+                <w:b w:val="0"/>
+                <w:sz w:val="19"/>
+              </w:rPr>
+              <w:t xml:space="preserve"> / </w:t>
+            </w:r>
+            <w:r>
+              <w:rPr>
+                <w:rFonts w:ascii="Consolas" w:hAnsi="Consolas"/>
+                <w:b w:val="0"/>
+                <w:sz w:val="19"/>
+              </w:rPr>
+              <w:t>ADMIN</w:t>
+            </w:r>
+            <w:r>
+              <w:rPr>
+                <w:b w:val="0"/>
+                <w:sz w:val="19"/>
+              </w:rPr>
+              <w:t>)</w:t>
+            </w:r>
+          </w:p>
+        </w:tc>
+      </w:tr>
+      <w:tr>
+        <w:tc>
+          <w:tcPr>
+            <w:tcW w:type="dxa" w:w="2880"/>
+          </w:tcPr>
+          <w:p>
+            <w:pPr>
+              <w:spacing w:after="40"/>
+            </w:pPr>
+            <w:r>
+              <w:rPr>
+                <w:sz w:val="19"/>
+              </w:rPr>
+            </w:r>
+            <w:r>
+              <w:rPr>
+                <w:rFonts w:ascii="Consolas" w:hAnsi="Consolas"/>
+                <w:b w:val="0"/>
+                <w:sz w:val="19"/>
+              </w:rPr>
+              <w:t>Book</w:t>
+            </w:r>
+          </w:p>
+        </w:tc>
+        <w:tc>
+          <w:tcPr>
+            <w:tcW w:type="dxa" w:w="2880"/>
+          </w:tcPr>
+          <w:p>
+            <w:pPr>
+              <w:spacing w:after="40"/>
+            </w:pPr>
+            <w:r>
+              <w:rPr>
+                <w:sz w:val="19"/>
+              </w:rPr>
+            </w:r>
+            <w:r>
+              <w:rPr>
+                <w:rFonts w:ascii="Consolas" w:hAnsi="Consolas"/>
+                <w:b w:val="0"/>
+                <w:sz w:val="19"/>
+              </w:rPr>
+              <w:t>books</w:t>
+            </w:r>
+          </w:p>
+        </w:tc>
+        <w:tc>
+          <w:tcPr>
+            <w:tcW w:type="dxa" w:w="2880"/>
+          </w:tcPr>
+          <w:p>
+            <w:pPr>
+              <w:spacing w:after="40"/>
+            </w:pPr>
+            <w:r>
+              <w:rPr>
+                <w:sz w:val="19"/>
+              </w:rPr>
+            </w:r>
+            <w:r>
+              <w:rPr>
+                <w:rFonts w:ascii="Consolas" w:hAnsi="Consolas"/>
+                <w:b w:val="0"/>
+                <w:sz w:val="19"/>
+              </w:rPr>
+              <w:t>cover_url</w:t>
+            </w:r>
+            <w:r>
+              <w:rPr>
+                <w:b w:val="0"/>
+                <w:sz w:val="19"/>
+              </w:rPr>
+              <w:t xml:space="preserve"> é o único campo opcional; há índice por </w:t>
+            </w:r>
+            <w:r>
+              <w:rPr>
+                <w:rFonts w:ascii="Consolas" w:hAnsi="Consolas"/>
+                <w:b w:val="0"/>
+                <w:sz w:val="19"/>
+              </w:rPr>
+              <w:t>genre</w:t>
+            </w:r>
+          </w:p>
+        </w:tc>
+      </w:tr>
+    </w:tbl>
+    <w:p/>
+    <w:p>
+      <w:r>
+        <w:rPr>
+          <w:rFonts w:ascii="Consolas" w:hAnsi="Consolas"/>
+          <w:b w:val="0"/>
+          <w:sz w:val="19"/>
+        </w:rPr>
+        <w:t>User</w:t>
+      </w:r>
+      <w:r>
+        <w:rPr>
+          <w:b w:val="0"/>
+        </w:rPr>
+        <w:t xml:space="preserve"> e </w:t>
+      </w:r>
+      <w:r>
+        <w:rPr>
+          <w:rFonts w:ascii="Consolas" w:hAnsi="Consolas"/>
+          <w:b w:val="0"/>
+          <w:sz w:val="19"/>
+        </w:rPr>
+        <w:t>Book</w:t>
+      </w:r>
+      <w:r>
+        <w:rPr>
+          <w:b w:val="0"/>
+        </w:rPr>
+        <w:t xml:space="preserve"> ainda não se relacionam: o acervo não registra quem cadastrou a obra, e a tabela de avaliações — que ligaria as duas — ainda não existe.</w:t>
       </w:r>
     </w:p>
     <w:p>

</xml_diff>

<commit_message>
docs: atualiza o fluxo de estado do front na seção 3.2
Desde que os botões do cabeçalho passaram a navegar, o App entrega ao Header
também a página atual e o onNavigate, não só o usuário.
</commit_message>
<xml_diff>
--- a/docs/arquitetura.docx
+++ b/docs/arquitetura.docx
@@ -2623,7 +2623,7 @@
         <w:rPr>
           <w:b w:val="0"/>
         </w:rPr>
-        <w:t xml:space="preserve"> guarda a página atual e o usuário logado, e repassa o usuário ao </w:t>
+        <w:t xml:space="preserve"> guarda a página atual e o usuário logado. Entrega as duas coisas ao </w:t>
       </w:r>
       <w:r>
         <w:rPr>
@@ -2637,7 +2637,7 @@
         <w:rPr>
           <w:b w:val="0"/>
         </w:rPr>
-        <w:t xml:space="preserve">, que por sua vez o entrega ao </w:t>
+        <w:t xml:space="preserve">: o usuário, que ele repassa ao </w:t>
       </w:r>
       <w:r>
         <w:rPr>
@@ -2651,7 +2651,21 @@
         <w:rPr>
           <w:b w:val="0"/>
         </w:rPr>
-        <w:t>.</w:t>
+        <w:t xml:space="preserve">, e a página atual mais o </w:t>
+      </w:r>
+      <w:r>
+        <w:rPr>
+          <w:rFonts w:ascii="Consolas" w:hAnsi="Consolas"/>
+          <w:b w:val="0"/>
+          <w:sz w:val="19"/>
+        </w:rPr>
+        <w:t>onNavigate</w:t>
+      </w:r>
+      <w:r>
+        <w:rPr>
+          <w:b w:val="0"/>
+        </w:rPr>
+        <w:t>, que os botões do menu usam para trocar de tela.</w:t>
       </w:r>
     </w:p>
     <w:p>

</xml_diff>

<commit_message>
docs: encurta o texto da arquitetura
O documento estava longo e explicava demais. Ficou com o essencial: visão
geral, a árvore de cada projeto, o que cada camada faz, o diagrama de classes
e como rodar. Saíram as justificativas de escolha de projeto, a seção que
seguia uma requisição passo a passo e o detalhamento do CSS.
</commit_message>
<xml_diff>
--- a/docs/arquitetura.docx
+++ b/docs/arquitetura.docx
@@ -8,14 +8,6 @@
       </w:pPr>
       <w:r>
         <w:t>Xopxe — Camadas da Arquitetura</w:t>
-      </w:r>
-    </w:p>
-    <w:p>
-      <w:r>
-        <w:rPr>
-          <w:b w:val="0"/>
-        </w:rPr>
-        <w:t>Documento de referência da organização do projeto: quais são as camadas, o que mora em cada diretório e como uma requisição atravessa o sistema.</w:t>
       </w:r>
     </w:p>
     <w:p>
@@ -31,7 +23,7 @@
         <w:rPr>
           <w:b w:val="0"/>
         </w:rPr>
-        <w:t>O Xopxe é um acervo de livros dividido em duas aplicações independentes:</w:t>
+        <w:t>O Xopxe é um site de acervo de livros. Ele é dividido em duas aplicações separadas:</w:t>
       </w:r>
     </w:p>
     <w:tbl>
@@ -42,15 +34,14 @@
         <w:tblLook w:firstColumn="1" w:firstRow="1" w:lastColumn="0" w:lastRow="0" w:noHBand="0" w:noVBand="1" w:val="04A0"/>
       </w:tblPr>
       <w:tblGrid>
-        <w:gridCol w:w="2160"/>
-        <w:gridCol w:w="2160"/>
-        <w:gridCol w:w="2160"/>
-        <w:gridCol w:w="2160"/>
+        <w:gridCol w:w="2880"/>
+        <w:gridCol w:w="2880"/>
+        <w:gridCol w:w="2880"/>
       </w:tblGrid>
       <w:tr>
         <w:tc>
           <w:tcPr>
-            <w:tcW w:type="dxa" w:w="2160"/>
+            <w:tcW w:type="dxa" w:w="2880"/>
           </w:tcPr>
           <w:p>
             <w:pPr>
@@ -66,13 +57,13 @@
                 <w:b/>
                 <w:sz w:val="19"/>
               </w:rPr>
-              <w:t>Aplicação</w:t>
+              <w:t>Parte</w:t>
             </w:r>
           </w:p>
         </w:tc>
         <w:tc>
           <w:tcPr>
-            <w:tcW w:type="dxa" w:w="2160"/>
+            <w:tcW w:type="dxa" w:w="2880"/>
           </w:tcPr>
           <w:p>
             <w:pPr>
@@ -94,7 +85,7 @@
         </w:tc>
         <w:tc>
           <w:tcPr>
-            <w:tcW w:type="dxa" w:w="2160"/>
+            <w:tcW w:type="dxa" w:w="2880"/>
           </w:tcPr>
           <w:p>
             <w:pPr>
@@ -114,33 +105,11 @@
             </w:r>
           </w:p>
         </w:tc>
-        <w:tc>
-          <w:tcPr>
-            <w:tcW w:type="dxa" w:w="2160"/>
-          </w:tcPr>
-          <w:p>
-            <w:pPr>
-              <w:spacing w:after="40"/>
-            </w:pPr>
-            <w:r>
-              <w:rPr>
-                <w:sz w:val="19"/>
-              </w:rPr>
-            </w:r>
-            <w:r>
-              <w:rPr>
-                <w:b/>
-                <w:sz w:val="19"/>
-              </w:rPr>
-              <w:t>Papel</w:t>
-            </w:r>
-          </w:p>
-        </w:tc>
       </w:tr>
       <w:tr>
         <w:tc>
           <w:tcPr>
-            <w:tcW w:type="dxa" w:w="2160"/>
+            <w:tcW w:type="dxa" w:w="2880"/>
           </w:tcPr>
           <w:p>
             <w:pPr>
@@ -163,7 +132,7 @@
         </w:tc>
         <w:tc>
           <w:tcPr>
-            <w:tcW w:type="dxa" w:w="2160"/>
+            <w:tcW w:type="dxa" w:w="2880"/>
           </w:tcPr>
           <w:p>
             <w:pPr>
@@ -185,7 +154,7 @@
         </w:tc>
         <w:tc>
           <w:tcPr>
-            <w:tcW w:type="dxa" w:w="2160"/>
+            <w:tcW w:type="dxa" w:w="2880"/>
           </w:tcPr>
           <w:p>
             <w:pPr>
@@ -205,33 +174,11 @@
             </w:r>
           </w:p>
         </w:tc>
-        <w:tc>
-          <w:tcPr>
-            <w:tcW w:type="dxa" w:w="2160"/>
-          </w:tcPr>
-          <w:p>
-            <w:pPr>
-              <w:spacing w:after="40"/>
-            </w:pPr>
-            <w:r>
-              <w:rPr>
-                <w:sz w:val="19"/>
-              </w:rPr>
-            </w:r>
-            <w:r>
-              <w:rPr>
-                <w:b w:val="0"/>
-                <w:sz w:val="19"/>
-              </w:rPr>
-              <w:t>API REST, regras de negócio, acesso ao banco</w:t>
-            </w:r>
-          </w:p>
-        </w:tc>
       </w:tr>
       <w:tr>
         <w:tc>
           <w:tcPr>
-            <w:tcW w:type="dxa" w:w="2160"/>
+            <w:tcW w:type="dxa" w:w="2880"/>
           </w:tcPr>
           <w:p>
             <w:pPr>
@@ -254,7 +201,7 @@
         </w:tc>
         <w:tc>
           <w:tcPr>
-            <w:tcW w:type="dxa" w:w="2160"/>
+            <w:tcW w:type="dxa" w:w="2880"/>
           </w:tcPr>
           <w:p>
             <w:pPr>
@@ -276,7 +223,7 @@
         </w:tc>
         <w:tc>
           <w:tcPr>
-            <w:tcW w:type="dxa" w:w="2160"/>
+            <w:tcW w:type="dxa" w:w="2880"/>
           </w:tcPr>
           <w:p>
             <w:pPr>
@@ -296,33 +243,11 @@
             </w:r>
           </w:p>
         </w:tc>
-        <w:tc>
-          <w:tcPr>
-            <w:tcW w:type="dxa" w:w="2160"/>
-          </w:tcPr>
-          <w:p>
-            <w:pPr>
-              <w:spacing w:after="40"/>
-            </w:pPr>
-            <w:r>
-              <w:rPr>
-                <w:sz w:val="19"/>
-              </w:rPr>
-            </w:r>
-            <w:r>
-              <w:rPr>
-                <w:b w:val="0"/>
-                <w:sz w:val="19"/>
-              </w:rPr>
-              <w:t>Interface do usuário (SPA)</w:t>
-            </w:r>
-          </w:p>
-        </w:tc>
       </w:tr>
       <w:tr>
         <w:tc>
           <w:tcPr>
-            <w:tcW w:type="dxa" w:w="2160"/>
+            <w:tcW w:type="dxa" w:w="2880"/>
           </w:tcPr>
           <w:p>
             <w:pPr>
@@ -344,7 +269,7 @@
         </w:tc>
         <w:tc>
           <w:tcPr>
-            <w:tcW w:type="dxa" w:w="2160"/>
+            <w:tcW w:type="dxa" w:w="2880"/>
           </w:tcPr>
           <w:p>
             <w:pPr>
@@ -360,13 +285,13 @@
                 <w:b w:val="0"/>
                 <w:sz w:val="19"/>
               </w:rPr>
-              <w:t>PostgreSQL 17 (contêiner)</w:t>
+              <w:t>PostgreSQL 17</w:t>
             </w:r>
           </w:p>
         </w:tc>
         <w:tc>
           <w:tcPr>
-            <w:tcW w:type="dxa" w:w="2160"/>
+            <w:tcW w:type="dxa" w:w="2880"/>
           </w:tcPr>
           <w:p>
             <w:pPr>
@@ -386,65 +311,9 @@
             </w:r>
           </w:p>
         </w:tc>
-        <w:tc>
-          <w:tcPr>
-            <w:tcW w:type="dxa" w:w="2160"/>
-          </w:tcPr>
-          <w:p>
-            <w:pPr>
-              <w:spacing w:after="40"/>
-            </w:pPr>
-            <w:r>
-              <w:rPr>
-                <w:sz w:val="19"/>
-              </w:rPr>
-            </w:r>
-            <w:r>
-              <w:rPr>
-                <w:b w:val="0"/>
-                <w:sz w:val="19"/>
-              </w:rPr>
-              <w:t>Persistência</w:t>
-            </w:r>
-          </w:p>
-        </w:tc>
       </w:tr>
     </w:tbl>
     <w:p/>
-    <w:p>
-      <w:r>
-        <w:rPr>
-          <w:b w:val="0"/>
-        </w:rPr>
-        <w:t xml:space="preserve">A camada de apresentação é um </w:t>
-      </w:r>
-      <w:r>
-        <w:rPr>
-          <w:b/>
-        </w:rPr>
-        <w:t>front-end separado</w:t>
-      </w:r>
-      <w:r>
-        <w:rPr>
-          <w:b w:val="0"/>
-        </w:rPr>
-        <w:t xml:space="preserve"> em React, e não templates Thymeleaf renderizados pelo servidor. Os dois lados conversam apenas por HTTP, trocando JSON. A consequência prática é que o back-end não devolve HTML em nenhum endpoint: ele é uma API pura.</w:t>
-      </w:r>
-    </w:p>
-    <w:p>
-      <w:pPr>
-        <w:pStyle w:val="Codigo"/>
-      </w:pPr>
-      <w:r>
-        <w:t>Navegador</w:t>
-        <w:br/>
-        <w:t xml:space="preserve">   │  HTTP + JSON</w:t>
-        <w:br/>
-        <w:t xml:space="preserve">   ▼</w:t>
-        <w:br/>
-        <w:t>React (Vite, :5173)  ──►  Spring Boot (:8080)  ──►  PostgreSQL (:5432)</w:t>
-      </w:r>
-    </w:p>
     <w:p>
       <w:pPr>
         <w:pStyle w:val="Heading2"/>
@@ -458,33 +327,7 @@
         <w:rPr>
           <w:b w:val="0"/>
         </w:rPr>
-        <w:t xml:space="preserve">O código é organizado </w:t>
-      </w:r>
-      <w:r>
-        <w:rPr>
-          <w:b/>
-        </w:rPr>
-        <w:t>por funcionalidade</w:t>
-      </w:r>
-      <w:r>
-        <w:rPr>
-          <w:b w:val="0"/>
-        </w:rPr>
-        <w:t xml:space="preserve"> (</w:t>
-      </w:r>
-      <w:r>
-        <w:rPr>
-          <w:rFonts w:ascii="Consolas" w:hAnsi="Consolas"/>
-          <w:b w:val="0"/>
-          <w:sz w:val="19"/>
-        </w:rPr>
-        <w:t>auth</w:t>
-      </w:r>
-      <w:r>
-        <w:rPr>
-          <w:b w:val="0"/>
-        </w:rPr>
-        <w:t xml:space="preserve">, </w:t>
+        <w:t>O código é separado por funcionalidade (</w:t>
       </w:r>
       <w:r>
         <w:rPr>
@@ -512,20 +355,6 @@
         <w:rPr>
           <w:b w:val="0"/>
         </w:rPr>
-        <w:t>), e dentro de cada pacote ficam as classes das várias camadas. A alternativa seria agrupar por camada (</w:t>
-      </w:r>
-      <w:r>
-        <w:rPr>
-          <w:rFonts w:ascii="Consolas" w:hAnsi="Consolas"/>
-          <w:b w:val="0"/>
-          <w:sz w:val="19"/>
-        </w:rPr>
-        <w:t>controllers/</w:t>
-      </w:r>
-      <w:r>
-        <w:rPr>
-          <w:b w:val="0"/>
-        </w:rPr>
         <w:t xml:space="preserve">, </w:t>
       </w:r>
       <w:r>
@@ -534,27 +363,13 @@
           <w:b w:val="0"/>
           <w:sz w:val="19"/>
         </w:rPr>
-        <w:t>services/</w:t>
+        <w:t>auth</w:t>
       </w:r>
       <w:r>
         <w:rPr>
           <w:b w:val="0"/>
         </w:rPr>
-        <w:t xml:space="preserve">, </w:t>
-      </w:r>
-      <w:r>
-        <w:rPr>
-          <w:rFonts w:ascii="Consolas" w:hAnsi="Consolas"/>
-          <w:b w:val="0"/>
-          <w:sz w:val="19"/>
-        </w:rPr>
-        <w:t>entities/</w:t>
-      </w:r>
-      <w:r>
-        <w:rPr>
-          <w:b w:val="0"/>
-        </w:rPr>
-        <w:t>); optamos por agrupar por funcionalidade porque mantém junto tudo que muda pelo mesmo motivo — mexer em "livro" abre um diretório só.</w:t>
+        <w:t>), e dentro de cada pacote ficam as classes das camadas.</w:t>
       </w:r>
     </w:p>
     <w:p>
@@ -566,63 +381,49 @@
         <w:br/>
         <w:t>├── java/br/com/dominadores/xopxe/</w:t>
         <w:br/>
-        <w:t>│   ├── XopxeApplication.java        ponto de entrada (@SpringBootApplication)</w:t>
+        <w:t>│   ├── XopxeApplication.java     classe principal</w:t>
         <w:br/>
-        <w:t>│   │</w:t>
+        <w:t>│   ├── book/</w:t>
         <w:br/>
-        <w:t>│   ├── book/                        funcionalidade: acervo</w:t>
+        <w:t>│   │   ├── Book.java             entidade JPA</w:t>
         <w:br/>
-        <w:t>│   │   ├── Book.java                Entidade JPA  ── camada de modelo</w:t>
+        <w:t>│   │   ├── BookRepository.java   repositório</w:t>
         <w:br/>
-        <w:t>│   │   ├── BookRepository.java      Repositório   ── camada de persistência</w:t>
+        <w:t>│   │   ├── BookService.java      regras de negócio</w:t>
         <w:br/>
-        <w:t>│   │   ├── BookService.java         Serviço       ── camada de negócio</w:t>
+        <w:t>│   │   ├── BookController.java   rotas HTTP</w:t>
         <w:br/>
-        <w:t>│   │   ├── BookController.java      Controlador   ── camada de apresentação</w:t>
+        <w:t>│   │   └── BookDtos.java         dados que entram e saem da API</w:t>
         <w:br/>
-        <w:t>│   │   └── BookDtos.java            DTOs de entrada e saída</w:t>
+        <w:t>│   ├── user/</w:t>
         <w:br/>
-        <w:t>│   │</w:t>
+        <w:t>│   │   ├── User.java             entidade JPA</w:t>
         <w:br/>
-        <w:t>│   ├── user/                        funcionalidade: usuários</w:t>
+        <w:t>│   │   ├── Role.java             enum USER / ADMIN</w:t>
         <w:br/>
-        <w:t>│   │   ├── User.java                Entidade JPA</w:t>
+        <w:t>│   │   ├── UserRepository.java   repositório</w:t>
         <w:br/>
-        <w:t>│   │   ├── Role.java                enum USER / ADMIN</w:t>
+        <w:t>│   │   └── DatabaseUserDetailsService.java</w:t>
         <w:br/>
-        <w:t>│   │   ├── UserRepository.java      Repositório</w:t>
+        <w:t>│   ├── auth/</w:t>
         <w:br/>
-        <w:t>│   │   └── DatabaseUserDetailsService.java   ponte com o Spring Security</w:t>
+        <w:t>│   │   ├── AuthController.java   login e cadastro</w:t>
         <w:br/>
-        <w:t>│   │</w:t>
+        <w:t>│   │   └── AuthDtos.java</w:t>
         <w:br/>
-        <w:t>│   ├── auth/                        funcionalidade: login e cadastro</w:t>
+        <w:t>│   └── config/</w:t>
         <w:br/>
-        <w:t>│   │   ├── AuthController.java      Controlador</w:t>
+        <w:t>│       ├── SecurityConfig.java   permissões, CORS e senha</w:t>
         <w:br/>
-        <w:t>│   │   └── AuthDtos.java            DTOs</w:t>
+        <w:t>│       ├── ApiExceptionHandler.java</w:t>
         <w:br/>
-        <w:t>│   │</w:t>
-        <w:br/>
-        <w:t>│   └── config/                      configuração transversal</w:t>
-        <w:br/>
-        <w:t>│       ├── SecurityConfig.java      regras de acesso, CORS, BCrypt</w:t>
-        <w:br/>
-        <w:t>│       ├── ApiExceptionHandler.java tradução de exceções em JSON</w:t>
-        <w:br/>
-        <w:t>│       └── DemoUsersSeeder.java     usuários de teste na 1ª execução</w:t>
-        <w:br/>
-        <w:t>│</w:t>
+        <w:t>│       └── DemoUsersSeeder.java  usuários de teste</w:t>
         <w:br/>
         <w:t>└── resources/</w:t>
         <w:br/>
-        <w:t xml:space="preserve">    ├── application.yaml             banco, Flyway, CORS, formato de erro</w:t>
+        <w:t xml:space="preserve">    ├── application.yaml</w:t>
         <w:br/>
-        <w:t xml:space="preserve">    └── db/migration/                Flyway — o schema versionado</w:t>
-        <w:br/>
-        <w:t xml:space="preserve">        ├── V1__create_users_table.sql</w:t>
-        <w:br/>
-        <w:t xml:space="preserve">        └── V2__create_books_table.sql</w:t>
+        <w:t xml:space="preserve">    └── db/migration/             scripts do Flyway que criam as tabelas</w:t>
       </w:r>
     </w:p>
     <w:p>
@@ -630,7 +431,7 @@
         <w:pStyle w:val="Heading3"/>
       </w:pPr>
       <w:r>
-        <w:t>2.1 Models / Entities (JPA)</w:t>
+        <w:t>Entidades (JPA)</w:t>
       </w:r>
     </w:p>
     <w:p>
@@ -660,7 +461,7 @@
         <w:rPr>
           <w:b w:val="0"/>
         </w:rPr>
-        <w:t xml:space="preserve"> são classes anotadas com </w:t>
+        <w:t xml:space="preserve"> são as classes anotadas com </w:t>
       </w:r>
       <w:r>
         <w:rPr>
@@ -674,7 +475,7 @@
         <w:rPr>
           <w:b w:val="0"/>
         </w:rPr>
-        <w:t>, e cada uma corresponde a uma tabela. São elas que definem o formato dos dados no resto do sistema.</w:t>
+        <w:t>. Cada uma representa uma tabela do banco.</w:t>
       </w:r>
     </w:p>
     <w:p>
@@ -707,21 +508,7 @@
         <w:rPr>
           <w:b w:val="0"/>
         </w:rPr>
-        <w:t>Dois pontos que valem ser explicados:</w:t>
-      </w:r>
-    </w:p>
-    <w:p>
-      <w:r>
-        <w:rPr>
-          <w:b/>
-        </w:rPr>
-        <w:t>O Flyway é o dono do schema, não o Hibernate.</w:t>
-      </w:r>
-      <w:r>
-        <w:rPr>
-          <w:b w:val="0"/>
-        </w:rPr>
-        <w:t xml:space="preserve"> O </w:t>
+        <w:t xml:space="preserve">Quem cria as tabelas é o Flyway, com os scripts SQL em </w:t>
       </w:r>
       <w:r>
         <w:rPr>
@@ -729,13 +516,13 @@
           <w:b w:val="0"/>
           <w:sz w:val="19"/>
         </w:rPr>
-        <w:t>application.yaml</w:t>
+        <w:t>db/migration/</w:t>
       </w:r>
       <w:r>
         <w:rPr>
           <w:b w:val="0"/>
         </w:rPr>
-        <w:t xml:space="preserve"> usa </w:t>
+        <w:t xml:space="preserve">. O Hibernate está configurado com </w:t>
       </w:r>
       <w:r>
         <w:rPr>
@@ -749,7 +536,23 @@
         <w:rPr>
           <w:b w:val="0"/>
         </w:rPr>
-        <w:t xml:space="preserve">: o Hibernate *confere* se as entidades batem com as tabelas e falha na inicialização se não baterem, mas nunca cria nem altera coluna. Quem cria as tabelas são os arquivos em </w:t>
+        <w:t>, ou seja, ele só confere se as entidades batem com o banco e não altera nada.</w:t>
+      </w:r>
+    </w:p>
+    <w:p>
+      <w:pPr>
+        <w:pStyle w:val="Heading3"/>
+      </w:pPr>
+      <w:r>
+        <w:t>DTOs</w:t>
+      </w:r>
+    </w:p>
+    <w:p>
+      <w:r>
+        <w:rPr>
+          <w:b w:val="0"/>
+        </w:rPr>
+        <w:t xml:space="preserve">São os </w:t>
       </w:r>
       <w:r>
         <w:rPr>
@@ -757,52 +560,14 @@
           <w:b w:val="0"/>
           <w:sz w:val="19"/>
         </w:rPr>
-        <w:t>db/migration/</w:t>
+        <w:t>record</w:t>
       </w:r>
       <w:r>
         <w:rPr>
           <w:b w:val="0"/>
         </w:rPr>
-        <w:t>, aplicados em ordem pelo Flyway. Assim o banco de cada integrante do grupo evolui igual, e a alteração de schema fica versionada no Git junto do código.</w:t>
+        <w:t xml:space="preserve">s de </w:t>
       </w:r>
-    </w:p>
-    <w:p>
-      <w:r>
-        <w:rPr>
-          <w:b/>
-        </w:rPr>
-        <w:t>A entidade nunca sai da API.</w:t>
-      </w:r>
-      <w:r>
-        <w:rPr>
-          <w:b w:val="0"/>
-        </w:rPr>
-        <w:t xml:space="preserve"> A senha do </w:t>
-      </w:r>
-      <w:r>
-        <w:rPr>
-          <w:rFonts w:ascii="Consolas" w:hAnsi="Consolas"/>
-          <w:b w:val="0"/>
-          <w:sz w:val="19"/>
-        </w:rPr>
-        <w:t>User</w:t>
-      </w:r>
-      <w:r>
-        <w:rPr>
-          <w:b w:val="0"/>
-        </w:rPr>
-        <w:t xml:space="preserve"> é um campo da entidade, e serializá-la direto no JSON vazaria o hash. Por isso existem os DTOs.</w:t>
-      </w:r>
-    </w:p>
-    <w:p>
-      <w:pPr>
-        <w:pStyle w:val="Heading3"/>
-      </w:pPr>
-      <w:r>
-        <w:t>2.2 DTOs — a fronteira da API</w:t>
-      </w:r>
-    </w:p>
-    <w:p>
       <w:r>
         <w:rPr>
           <w:rFonts w:ascii="Consolas" w:hAnsi="Consolas"/>
@@ -829,68 +594,15 @@
         <w:rPr>
           <w:b w:val="0"/>
         </w:rPr>
-        <w:t xml:space="preserve"> guardam </w:t>
+        <w:t>. Servem para separar o que trafega na API do que está no banco.</w:t>
       </w:r>
-      <w:r>
-        <w:rPr>
-          <w:rFonts w:ascii="Consolas" w:hAnsi="Consolas"/>
-          <w:b w:val="0"/>
-          <w:sz w:val="19"/>
-        </w:rPr>
-        <w:t>record</w:t>
-      </w:r>
+    </w:p>
+    <w:p>
       <w:r>
         <w:rPr>
           <w:b w:val="0"/>
         </w:rPr>
-        <w:t>s que representam exatamente o que entra e o que sai de cada endpoint:</w:t>
-      </w:r>
-    </w:p>
-    <w:p>
-      <w:pPr>
-        <w:pStyle w:val="ListBullet"/>
-        <w:spacing w:after="80"/>
-        <w:ind w:left="432"/>
-      </w:pPr>
-      <w:r>
-        <w:rPr>
-          <w:b/>
-        </w:rPr>
-        <w:t>Entrada</w:t>
-      </w:r>
-      <w:r>
-        <w:rPr>
-          <w:b w:val="0"/>
-        </w:rPr>
-        <w:t xml:space="preserve"> (</w:t>
-      </w:r>
-      <w:r>
-        <w:rPr>
-          <w:rFonts w:ascii="Consolas" w:hAnsi="Consolas"/>
-          <w:b w:val="0"/>
-          <w:sz w:val="19"/>
-        </w:rPr>
-        <w:t>RegisterRequest</w:t>
-      </w:r>
-      <w:r>
-        <w:rPr>
-          <w:b w:val="0"/>
-        </w:rPr>
-        <w:t xml:space="preserve">, </w:t>
-      </w:r>
-      <w:r>
-        <w:rPr>
-          <w:rFonts w:ascii="Consolas" w:hAnsi="Consolas"/>
-          <w:b w:val="0"/>
-          <w:sz w:val="19"/>
-        </w:rPr>
-        <w:t>CreateBookRequest</w:t>
-      </w:r>
-      <w:r>
-        <w:rPr>
-          <w:b w:val="0"/>
-        </w:rPr>
-        <w:t>): validados com Bean Validation (</w:t>
+        <w:t xml:space="preserve">Os de entrada são validados com </w:t>
       </w:r>
       <w:r>
         <w:rPr>
@@ -918,7 +630,7 @@
         <w:rPr>
           <w:b w:val="0"/>
         </w:rPr>
-        <w:t xml:space="preserve">, </w:t>
+        <w:t xml:space="preserve"> e </w:t>
       </w:r>
       <w:r>
         <w:rPr>
@@ -932,7 +644,7 @@
         <w:rPr>
           <w:b w:val="0"/>
         </w:rPr>
-        <w:t xml:space="preserve">, </w:t>
+        <w:t xml:space="preserve">. Os de saída são montados a partir da entidade por um método </w:t>
       </w:r>
       <w:r>
         <w:rPr>
@@ -940,46 +652,13 @@
           <w:b w:val="0"/>
           <w:sz w:val="19"/>
         </w:rPr>
-        <w:t>@PastOrPresent</w:t>
+        <w:t>from(...)</w:t>
       </w:r>
       <w:r>
         <w:rPr>
           <w:b w:val="0"/>
         </w:rPr>
-        <w:t xml:space="preserve">). O </w:t>
-      </w:r>
-      <w:r>
-        <w:rPr>
-          <w:rFonts w:ascii="Consolas" w:hAnsi="Consolas"/>
-          <w:b w:val="0"/>
-          <w:sz w:val="19"/>
-        </w:rPr>
-        <w:t>@Valid</w:t>
-      </w:r>
-      <w:r>
-        <w:rPr>
-          <w:b w:val="0"/>
-        </w:rPr>
-        <w:t xml:space="preserve"> no controlador faz o Spring rejeitar o corpo inválido antes de qualquer código nosso rodar.</w:t>
-      </w:r>
-    </w:p>
-    <w:p>
-      <w:pPr>
-        <w:pStyle w:val="ListBullet"/>
-        <w:spacing w:after="80"/>
-        <w:ind w:left="432"/>
-      </w:pPr>
-      <w:r>
-        <w:rPr>
-          <w:b/>
-        </w:rPr>
-        <w:t>Saída</w:t>
-      </w:r>
-      <w:r>
-        <w:rPr>
-          <w:b w:val="0"/>
-        </w:rPr>
-        <w:t xml:space="preserve"> (</w:t>
+        <w:t xml:space="preserve">. O </w:t>
       </w:r>
       <w:r>
         <w:rPr>
@@ -993,7 +672,23 @@
         <w:rPr>
           <w:b w:val="0"/>
         </w:rPr>
-        <w:t xml:space="preserve">, </w:t>
+        <w:t>, por exemplo, não tem o campo de senha, então a senha nunca vai para o front.</w:t>
+      </w:r>
+    </w:p>
+    <w:p>
+      <w:pPr>
+        <w:pStyle w:val="Heading3"/>
+      </w:pPr>
+      <w:r>
+        <w:t>Repositórios</w:t>
+      </w:r>
+    </w:p>
+    <w:p>
+      <w:r>
+        <w:rPr>
+          <w:b w:val="0"/>
+        </w:rPr>
+        <w:t xml:space="preserve">São interfaces que estendem </w:t>
       </w:r>
       <w:r>
         <w:rPr>
@@ -1001,83 +696,13 @@
           <w:b w:val="0"/>
           <w:sz w:val="19"/>
         </w:rPr>
-        <w:t>BookResponse</w:t>
+        <w:t>JpaRepository</w:t>
       </w:r>
       <w:r>
         <w:rPr>
           <w:b w:val="0"/>
         </w:rPr>
-        <w:t xml:space="preserve">): montados a partir da entidade por um método estático </w:t>
-      </w:r>
-      <w:r>
-        <w:rPr>
-          <w:rFonts w:ascii="Consolas" w:hAnsi="Consolas"/>
-          <w:b w:val="0"/>
-          <w:sz w:val="19"/>
-        </w:rPr>
-        <w:t>from(...)</w:t>
-      </w:r>
-      <w:r>
-        <w:rPr>
-          <w:b w:val="0"/>
-        </w:rPr>
-        <w:t xml:space="preserve">. </w:t>
-      </w:r>
-      <w:r>
-        <w:rPr>
-          <w:rFonts w:ascii="Consolas" w:hAnsi="Consolas"/>
-          <w:b w:val="0"/>
-          <w:sz w:val="19"/>
-        </w:rPr>
-        <w:t>UserResponse</w:t>
-      </w:r>
-      <w:r>
-        <w:rPr>
-          <w:b w:val="0"/>
-        </w:rPr>
-        <w:t xml:space="preserve"> simplesmente não tem campo de senha — o vazamento fica impossível por construção, não por disciplina.</w:t>
-      </w:r>
-    </w:p>
-    <w:p>
-      <w:pPr>
-        <w:pStyle w:val="Heading3"/>
-      </w:pPr>
-      <w:r>
-        <w:t>2.3 Repositories</w:t>
-      </w:r>
-    </w:p>
-    <w:p>
-      <w:r>
-        <w:rPr>
-          <w:b w:val="0"/>
-        </w:rPr>
-        <w:t xml:space="preserve">Interfaces que estendem </w:t>
-      </w:r>
-      <w:r>
-        <w:rPr>
-          <w:rFonts w:ascii="Consolas" w:hAnsi="Consolas"/>
-          <w:b w:val="0"/>
-          <w:sz w:val="19"/>
-        </w:rPr>
-        <w:t>JpaRepository&lt;Entidade, TipoDoId&gt;</w:t>
-      </w:r>
-      <w:r>
-        <w:rPr>
-          <w:b w:val="0"/>
-        </w:rPr>
-        <w:t xml:space="preserve">. Não têm implementação: o Spring Data gera a classe concreta em tempo de execução e deriva a consulta SQL a partir do </w:t>
-      </w:r>
-      <w:r>
-        <w:rPr>
-          <w:b/>
-        </w:rPr>
-        <w:t>nome do método</w:t>
-      </w:r>
-      <w:r>
-        <w:rPr>
-          <w:b w:val="0"/>
-        </w:rPr>
-        <w:t>.</w:t>
+        <w:t>. O Spring Data cria a consulta a partir do nome do método.</w:t>
       </w:r>
     </w:p>
     <w:p>
@@ -1087,9 +712,9 @@
       <w:r>
         <w:t>public interface UserRepository extends JpaRepository&lt;User, Long&gt; {</w:t>
         <w:br/>
-        <w:t xml:space="preserve">    Optional&lt;User&gt; findByEmail(String email);   // select * from users where email = ?</w:t>
+        <w:t xml:space="preserve">    Optional&lt;User&gt; findByEmail(String email);</w:t>
         <w:br/>
-        <w:t xml:space="preserve">    boolean existsByEmail(String email);        // select count(*) &gt; 0 ...</w:t>
+        <w:t xml:space="preserve">    boolean existsByEmail(String email);</w:t>
         <w:br/>
         <w:t>}</w:t>
       </w:r>
@@ -1099,7 +724,7 @@
         <w:rPr>
           <w:b w:val="0"/>
         </w:rPr>
-        <w:t xml:space="preserve">Herdamos de graça </w:t>
+        <w:t xml:space="preserve">Métodos como </w:t>
       </w:r>
       <w:r>
         <w:rPr>
@@ -1127,7 +752,7 @@
         <w:rPr>
           <w:b w:val="0"/>
         </w:rPr>
-        <w:t xml:space="preserve">, </w:t>
+        <w:t xml:space="preserve"> e </w:t>
       </w:r>
       <w:r>
         <w:rPr>
@@ -1141,21 +766,7 @@
         <w:rPr>
           <w:b w:val="0"/>
         </w:rPr>
-        <w:t xml:space="preserve">, </w:t>
-      </w:r>
-      <w:r>
-        <w:rPr>
-          <w:rFonts w:ascii="Consolas" w:hAnsi="Consolas"/>
-          <w:b w:val="0"/>
-          <w:sz w:val="19"/>
-        </w:rPr>
-        <w:t>deleteById</w:t>
-      </w:r>
-      <w:r>
-        <w:rPr>
-          <w:b w:val="0"/>
-        </w:rPr>
-        <w:t xml:space="preserve"> e a paginação.</w:t>
+        <w:t xml:space="preserve"> já vêm prontos.</w:t>
       </w:r>
     </w:p>
     <w:p>
@@ -1163,7 +774,7 @@
         <w:pStyle w:val="Heading3"/>
       </w:pPr>
       <w:r>
-        <w:t>2.4 Services</w:t>
+        <w:t>Serviços</w:t>
       </w:r>
     </w:p>
     <w:p>
@@ -1171,7 +782,7 @@
         <w:rPr>
           <w:b w:val="0"/>
         </w:rPr>
-        <w:t xml:space="preserve">Camada de regra de negócio, entre o controlador e o repositório. </w:t>
+        <w:t xml:space="preserve">Ficam entre o controlador e o repositório e guardam as regras de negócio. O </w:t>
       </w:r>
       <w:r>
         <w:rPr>
@@ -1185,66 +796,7 @@
         <w:rPr>
           <w:b w:val="0"/>
         </w:rPr>
-        <w:t xml:space="preserve"> existe para que o </w:t>
-      </w:r>
-      <w:r>
-        <w:rPr>
-          <w:rFonts w:ascii="Consolas" w:hAnsi="Consolas"/>
-          <w:b w:val="0"/>
-          <w:sz w:val="19"/>
-        </w:rPr>
-        <w:t>BookController</w:t>
-      </w:r>
-      <w:r>
-        <w:rPr>
-          <w:b w:val="0"/>
-        </w:rPr>
-        <w:t xml:space="preserve"> não converse com o </w:t>
-      </w:r>
-      <w:r>
-        <w:rPr>
-          <w:rFonts w:ascii="Consolas" w:hAnsi="Consolas"/>
-          <w:b w:val="0"/>
-          <w:sz w:val="19"/>
-        </w:rPr>
-        <w:t>BookRepository</w:t>
-      </w:r>
-      <w:r>
-        <w:rPr>
-          <w:b w:val="0"/>
-        </w:rPr>
-        <w:t xml:space="preserve"> diretamente: o controlador cuida de HTTP, o serviço cuida da regra.</w:t>
-      </w:r>
-    </w:p>
-    <w:p>
-      <w:pPr>
-        <w:ind w:left="504"/>
-      </w:pPr>
-      <w:r>
-        <w:rPr>
-          <w:b/>
-        </w:rPr>
-        <w:t>Estado atual:</w:t>
-      </w:r>
-      <w:r>
-        <w:rPr>
-          <w:b w:val="0"/>
-        </w:rPr>
-        <w:t xml:space="preserve"> </w:t>
-      </w:r>
-      <w:r>
-        <w:rPr>
-          <w:rFonts w:ascii="Consolas" w:hAnsi="Consolas"/>
-          <w:b w:val="0"/>
-          <w:sz w:val="19"/>
-        </w:rPr>
-        <w:t>BookService</w:t>
-      </w:r>
-      <w:r>
-        <w:rPr>
-          <w:b w:val="0"/>
-        </w:rPr>
-        <w:t xml:space="preserve"> é um esqueleto — os três métodos lançam </w:t>
+        <w:t xml:space="preserve"> ainda não foi implementado: os métodos lançam </w:t>
       </w:r>
       <w:r>
         <w:rPr>
@@ -1258,21 +810,7 @@
         <w:rPr>
           <w:b w:val="0"/>
         </w:rPr>
-        <w:t>. Os endpoints de livro respondem, portanto, HTTP 500 até que a implementação seja feita. O cadastro e o catálogo da interface ainda usam dados de exemplo (</w:t>
-      </w:r>
-      <w:r>
-        <w:rPr>
-          <w:rFonts w:ascii="Consolas" w:hAnsi="Consolas"/>
-          <w:b w:val="0"/>
-          <w:sz w:val="19"/>
-        </w:rPr>
-        <w:t>frontend/src/data/books-mock.js</w:t>
-      </w:r>
-      <w:r>
-        <w:rPr>
-          <w:b w:val="0"/>
-        </w:rPr>
-        <w:t>). O fluxo de autenticação, esse sim, está completo e funcionando.</w:t>
+        <w:t>, então as rotas de livro respondem erro 500. O catálogo da tela ainda usa dados mockados.</w:t>
       </w:r>
     </w:p>
     <w:p>
@@ -1280,7 +818,7 @@
         <w:pStyle w:val="Heading3"/>
       </w:pPr>
       <w:r>
-        <w:t>2.5 Controllers</w:t>
+        <w:t>Controladores</w:t>
       </w:r>
     </w:p>
     <w:p>
@@ -1288,7 +826,7 @@
         <w:rPr>
           <w:b w:val="0"/>
         </w:rPr>
-        <w:t xml:space="preserve">Classes </w:t>
+        <w:t xml:space="preserve">São as classes </w:t>
       </w:r>
       <w:r>
         <w:rPr>
@@ -1302,7 +840,7 @@
         <w:rPr>
           <w:b w:val="0"/>
         </w:rPr>
-        <w:t xml:space="preserve"> que expõem as rotas HTTP. Cada método traduz uma requisição em uma chamada de serviço e devolve um DTO, que o Spring serializa em JSON.</w:t>
+        <w:t xml:space="preserve"> com as rotas:</w:t>
       </w:r>
     </w:p>
     <w:tbl>
@@ -1313,15 +851,14 @@
         <w:tblLook w:firstColumn="1" w:firstRow="1" w:lastColumn="0" w:lastRow="0" w:noHBand="0" w:noVBand="1" w:val="04A0"/>
       </w:tblPr>
       <w:tblGrid>
-        <w:gridCol w:w="2160"/>
-        <w:gridCol w:w="2160"/>
-        <w:gridCol w:w="2160"/>
-        <w:gridCol w:w="2160"/>
+        <w:gridCol w:w="2880"/>
+        <w:gridCol w:w="2880"/>
+        <w:gridCol w:w="2880"/>
       </w:tblGrid>
       <w:tr>
         <w:tc>
           <w:tcPr>
-            <w:tcW w:type="dxa" w:w="2160"/>
+            <w:tcW w:type="dxa" w:w="2880"/>
           </w:tcPr>
           <w:p>
             <w:pPr>
@@ -1343,7 +880,7 @@
         </w:tc>
         <w:tc>
           <w:tcPr>
-            <w:tcW w:type="dxa" w:w="2160"/>
+            <w:tcW w:type="dxa" w:w="2880"/>
           </w:tcPr>
           <w:p>
             <w:pPr>
@@ -1365,7 +902,7 @@
         </w:tc>
         <w:tc>
           <w:tcPr>
-            <w:tcW w:type="dxa" w:w="2160"/>
+            <w:tcW w:type="dxa" w:w="2880"/>
           </w:tcPr>
           <w:p>
             <w:pPr>
@@ -1385,33 +922,11 @@
             </w:r>
           </w:p>
         </w:tc>
-        <w:tc>
-          <w:tcPr>
-            <w:tcW w:type="dxa" w:w="2160"/>
-          </w:tcPr>
-          <w:p>
-            <w:pPr>
-              <w:spacing w:after="40"/>
-            </w:pPr>
-            <w:r>
-              <w:rPr>
-                <w:sz w:val="19"/>
-              </w:rPr>
-            </w:r>
-            <w:r>
-              <w:rPr>
-                <w:b/>
-                <w:sz w:val="19"/>
-              </w:rPr>
-              <w:t>Faz</w:t>
-            </w:r>
-          </w:p>
-        </w:tc>
       </w:tr>
       <w:tr>
         <w:tc>
           <w:tcPr>
-            <w:tcW w:type="dxa" w:w="2160"/>
+            <w:tcW w:type="dxa" w:w="2880"/>
           </w:tcPr>
           <w:p>
             <w:pPr>
@@ -1433,7 +948,7 @@
         </w:tc>
         <w:tc>
           <w:tcPr>
-            <w:tcW w:type="dxa" w:w="2160"/>
+            <w:tcW w:type="dxa" w:w="2880"/>
           </w:tcPr>
           <w:p>
             <w:pPr>
@@ -1456,7 +971,7 @@
         </w:tc>
         <w:tc>
           <w:tcPr>
-            <w:tcW w:type="dxa" w:w="2160"/>
+            <w:tcW w:type="dxa" w:w="2880"/>
           </w:tcPr>
           <w:p>
             <w:pPr>
@@ -1476,48 +991,11 @@
             </w:r>
           </w:p>
         </w:tc>
-        <w:tc>
-          <w:tcPr>
-            <w:tcW w:type="dxa" w:w="2160"/>
-          </w:tcPr>
-          <w:p>
-            <w:pPr>
-              <w:spacing w:after="40"/>
-            </w:pPr>
-            <w:r>
-              <w:rPr>
-                <w:sz w:val="19"/>
-              </w:rPr>
-            </w:r>
-            <w:r>
-              <w:rPr>
-                <w:b w:val="0"/>
-                <w:sz w:val="19"/>
-              </w:rPr>
-              <w:t xml:space="preserve">cria conta, devolve </w:t>
-            </w:r>
-            <w:r>
-              <w:rPr>
-                <w:rFonts w:ascii="Consolas" w:hAnsi="Consolas"/>
-                <w:b w:val="0"/>
-                <w:sz w:val="19"/>
-              </w:rPr>
-              <w:t>UserResponse</w:t>
-            </w:r>
-            <w:r>
-              <w:rPr>
-                <w:b w:val="0"/>
-                <w:sz w:val="19"/>
-              </w:rPr>
-              <w:t xml:space="preserve"> (201)</w:t>
-            </w:r>
-          </w:p>
-        </w:tc>
       </w:tr>
       <w:tr>
         <w:tc>
           <w:tcPr>
-            <w:tcW w:type="dxa" w:w="2160"/>
+            <w:tcW w:type="dxa" w:w="2880"/>
           </w:tcPr>
           <w:p>
             <w:pPr>
@@ -1539,7 +1017,7 @@
         </w:tc>
         <w:tc>
           <w:tcPr>
-            <w:tcW w:type="dxa" w:w="2160"/>
+            <w:tcW w:type="dxa" w:w="2880"/>
           </w:tcPr>
           <w:p>
             <w:pPr>
@@ -1562,7 +1040,7 @@
         </w:tc>
         <w:tc>
           <w:tcPr>
-            <w:tcW w:type="dxa" w:w="2160"/>
+            <w:tcW w:type="dxa" w:w="2880"/>
           </w:tcPr>
           <w:p>
             <w:pPr>
@@ -1582,41 +1060,11 @@
             </w:r>
           </w:p>
         </w:tc>
-        <w:tc>
-          <w:tcPr>
-            <w:tcW w:type="dxa" w:w="2160"/>
-          </w:tcPr>
-          <w:p>
-            <w:pPr>
-              <w:spacing w:after="40"/>
-            </w:pPr>
-            <w:r>
-              <w:rPr>
-                <w:sz w:val="19"/>
-              </w:rPr>
-            </w:r>
-            <w:r>
-              <w:rPr>
-                <w:b w:val="0"/>
-                <w:sz w:val="19"/>
-              </w:rPr>
-              <w:t xml:space="preserve">valida credenciais, devolve </w:t>
-            </w:r>
-            <w:r>
-              <w:rPr>
-                <w:rFonts w:ascii="Consolas" w:hAnsi="Consolas"/>
-                <w:b w:val="0"/>
-                <w:sz w:val="19"/>
-              </w:rPr>
-              <w:t>UserResponse</w:t>
-            </w:r>
-          </w:p>
-        </w:tc>
       </w:tr>
       <w:tr>
         <w:tc>
           <w:tcPr>
-            <w:tcW w:type="dxa" w:w="2160"/>
+            <w:tcW w:type="dxa" w:w="2880"/>
           </w:tcPr>
           <w:p>
             <w:pPr>
@@ -1638,7 +1086,7 @@
         </w:tc>
         <w:tc>
           <w:tcPr>
-            <w:tcW w:type="dxa" w:w="2160"/>
+            <w:tcW w:type="dxa" w:w="2880"/>
           </w:tcPr>
           <w:p>
             <w:pPr>
@@ -1661,7 +1109,7 @@
         </w:tc>
         <w:tc>
           <w:tcPr>
-            <w:tcW w:type="dxa" w:w="2160"/>
+            <w:tcW w:type="dxa" w:w="2880"/>
           </w:tcPr>
           <w:p>
             <w:pPr>
@@ -1681,56 +1129,11 @@
             </w:r>
           </w:p>
         </w:tc>
-        <w:tc>
-          <w:tcPr>
-            <w:tcW w:type="dxa" w:w="2160"/>
-          </w:tcPr>
-          <w:p>
-            <w:pPr>
-              <w:spacing w:after="40"/>
-            </w:pPr>
-            <w:r>
-              <w:rPr>
-                <w:sz w:val="19"/>
-              </w:rPr>
-            </w:r>
-            <w:r>
-              <w:rPr>
-                <w:b w:val="0"/>
-                <w:sz w:val="19"/>
-              </w:rPr>
-              <w:t xml:space="preserve">lista o acervo, com </w:t>
-            </w:r>
-            <w:r>
-              <w:rPr>
-                <w:rFonts w:ascii="Consolas" w:hAnsi="Consolas"/>
-                <w:b w:val="0"/>
-                <w:sz w:val="19"/>
-              </w:rPr>
-              <w:t>?q=</w:t>
-            </w:r>
-            <w:r>
-              <w:rPr>
-                <w:b w:val="0"/>
-                <w:sz w:val="19"/>
-              </w:rPr>
-              <w:t xml:space="preserve"> e </w:t>
-            </w:r>
-            <w:r>
-              <w:rPr>
-                <w:rFonts w:ascii="Consolas" w:hAnsi="Consolas"/>
-                <w:b w:val="0"/>
-                <w:sz w:val="19"/>
-              </w:rPr>
-              <w:t>?genre=</w:t>
-            </w:r>
-          </w:p>
-        </w:tc>
       </w:tr>
       <w:tr>
         <w:tc>
           <w:tcPr>
-            <w:tcW w:type="dxa" w:w="2160"/>
+            <w:tcW w:type="dxa" w:w="2880"/>
           </w:tcPr>
           <w:p>
             <w:pPr>
@@ -1752,7 +1155,7 @@
         </w:tc>
         <w:tc>
           <w:tcPr>
-            <w:tcW w:type="dxa" w:w="2160"/>
+            <w:tcW w:type="dxa" w:w="2880"/>
           </w:tcPr>
           <w:p>
             <w:pPr>
@@ -1775,7 +1178,7 @@
         </w:tc>
         <w:tc>
           <w:tcPr>
-            <w:tcW w:type="dxa" w:w="2160"/>
+            <w:tcW w:type="dxa" w:w="2880"/>
           </w:tcPr>
           <w:p>
             <w:pPr>
@@ -1795,33 +1198,11 @@
             </w:r>
           </w:p>
         </w:tc>
-        <w:tc>
-          <w:tcPr>
-            <w:tcW w:type="dxa" w:w="2160"/>
-          </w:tcPr>
-          <w:p>
-            <w:pPr>
-              <w:spacing w:after="40"/>
-            </w:pPr>
-            <w:r>
-              <w:rPr>
-                <w:sz w:val="19"/>
-              </w:rPr>
-            </w:r>
-            <w:r>
-              <w:rPr>
-                <w:b w:val="0"/>
-                <w:sz w:val="19"/>
-              </w:rPr>
-              <w:t>detalha uma obra</w:t>
-            </w:r>
-          </w:p>
-        </w:tc>
       </w:tr>
       <w:tr>
         <w:tc>
           <w:tcPr>
-            <w:tcW w:type="dxa" w:w="2160"/>
+            <w:tcW w:type="dxa" w:w="2880"/>
           </w:tcPr>
           <w:p>
             <w:pPr>
@@ -1843,7 +1224,7 @@
         </w:tc>
         <w:tc>
           <w:tcPr>
-            <w:tcW w:type="dxa" w:w="2160"/>
+            <w:tcW w:type="dxa" w:w="2880"/>
           </w:tcPr>
           <w:p>
             <w:pPr>
@@ -1866,29 +1247,7 @@
         </w:tc>
         <w:tc>
           <w:tcPr>
-            <w:tcW w:type="dxa" w:w="2160"/>
-          </w:tcPr>
-          <w:p>
-            <w:pPr>
-              <w:spacing w:after="40"/>
-            </w:pPr>
-            <w:r>
-              <w:rPr>
-                <w:sz w:val="19"/>
-              </w:rPr>
-            </w:r>
-            <w:r>
-              <w:rPr>
-                <w:b/>
-                <w:sz w:val="19"/>
-              </w:rPr>
-              <w:t>ADMIN</w:t>
-            </w:r>
-          </w:p>
-        </w:tc>
-        <w:tc>
-          <w:tcPr>
-            <w:tcW w:type="dxa" w:w="2160"/>
+            <w:tcW w:type="dxa" w:w="2880"/>
           </w:tcPr>
           <w:p>
             <w:pPr>
@@ -1904,7 +1263,7 @@
                 <w:b w:val="0"/>
                 <w:sz w:val="19"/>
               </w:rPr>
-              <w:t>cadastra uma obra (201)</w:t>
+              <w:t>ADMIN</w:t>
             </w:r>
           </w:p>
         </w:tc>
@@ -1916,14 +1275,14 @@
         <w:pStyle w:val="Heading3"/>
       </w:pPr>
       <w:r>
-        <w:t>2.6 Configuração transversal</w:t>
+        <w:t>Configuração</w:t>
       </w:r>
     </w:p>
     <w:p>
       <w:r>
         <w:rPr>
           <w:rFonts w:ascii="Consolas" w:hAnsi="Consolas"/>
-          <w:b/>
+          <w:b w:val="0"/>
           <w:sz w:val="19"/>
         </w:rPr>
         <w:t>SecurityConfig</w:t>
@@ -1932,148 +1291,7 @@
         <w:rPr>
           <w:b w:val="0"/>
         </w:rPr>
-        <w:t xml:space="preserve"> concentra três decisões:</w:t>
-      </w:r>
-    </w:p>
-    <w:p>
-      <w:pPr>
-        <w:pStyle w:val="ListNumber"/>
-        <w:spacing w:after="80"/>
-        <w:ind w:left="432"/>
-      </w:pPr>
-      <w:r>
-        <w:rPr>
-          <w:b/>
-        </w:rPr>
-        <w:t>Quem pode o quê</w:t>
-      </w:r>
-      <w:r>
-        <w:rPr>
-          <w:b w:val="0"/>
-        </w:rPr>
-        <w:t xml:space="preserve"> — login, cadastro e leitura do acervo são públicos; </w:t>
-      </w:r>
-      <w:r>
-        <w:rPr>
-          <w:rFonts w:ascii="Consolas" w:hAnsi="Consolas"/>
-          <w:b w:val="0"/>
-          <w:sz w:val="19"/>
-        </w:rPr>
-        <w:t>POST /api/books</w:t>
-      </w:r>
-      <w:r>
-        <w:rPr>
-          <w:b w:val="0"/>
-        </w:rPr>
-        <w:t xml:space="preserve"> exige o papel </w:t>
-      </w:r>
-      <w:r>
-        <w:rPr>
-          <w:rFonts w:ascii="Consolas" w:hAnsi="Consolas"/>
-          <w:b w:val="0"/>
-          <w:sz w:val="19"/>
-        </w:rPr>
-        <w:t>ADMIN</w:t>
-      </w:r>
-      <w:r>
-        <w:rPr>
-          <w:b w:val="0"/>
-        </w:rPr>
-        <w:t>; qualquer outra rota exige estar autenticado.</w:t>
-      </w:r>
-    </w:p>
-    <w:p>
-      <w:pPr>
-        <w:pStyle w:val="ListNumber"/>
-        <w:spacing w:after="80"/>
-        <w:ind w:left="432"/>
-      </w:pPr>
-      <w:r>
-        <w:rPr>
-          <w:b/>
-        </w:rPr>
-        <w:t>CORS</w:t>
-      </w:r>
-      <w:r>
-        <w:rPr>
-          <w:b w:val="0"/>
-        </w:rPr>
-        <w:t xml:space="preserve"> — o navegador só deixa o front em </w:t>
-      </w:r>
-      <w:r>
-        <w:rPr>
-          <w:rFonts w:ascii="Consolas" w:hAnsi="Consolas"/>
-          <w:b w:val="0"/>
-          <w:sz w:val="19"/>
-        </w:rPr>
-        <w:t>localhost:5173</w:t>
-      </w:r>
-      <w:r>
-        <w:rPr>
-          <w:b w:val="0"/>
-        </w:rPr>
-        <w:t xml:space="preserve"> chamar </w:t>
-      </w:r>
-      <w:r>
-        <w:rPr>
-          <w:rFonts w:ascii="Consolas" w:hAnsi="Consolas"/>
-          <w:b w:val="0"/>
-          <w:sz w:val="19"/>
-        </w:rPr>
-        <w:t>localhost:8080</w:t>
-      </w:r>
-      <w:r>
-        <w:rPr>
-          <w:b w:val="0"/>
-        </w:rPr>
-        <w:t xml:space="preserve"> se o servidor autorizar explicitamente essa origem. A origem permitida vem do </w:t>
-      </w:r>
-      <w:r>
-        <w:rPr>
-          <w:rFonts w:ascii="Consolas" w:hAnsi="Consolas"/>
-          <w:b w:val="0"/>
-          <w:sz w:val="19"/>
-        </w:rPr>
-        <w:t>application.yaml</w:t>
-      </w:r>
-      <w:r>
-        <w:rPr>
-          <w:b w:val="0"/>
-        </w:rPr>
-        <w:t>.</w:t>
-      </w:r>
-    </w:p>
-    <w:p>
-      <w:pPr>
-        <w:pStyle w:val="ListNumber"/>
-        <w:spacing w:after="80"/>
-        <w:ind w:left="432"/>
-      </w:pPr>
-      <w:r>
-        <w:rPr>
-          <w:b/>
-        </w:rPr>
-        <w:t>Senhas</w:t>
-      </w:r>
-      <w:r>
-        <w:rPr>
-          <w:b w:val="0"/>
-        </w:rPr>
-        <w:t xml:space="preserve"> — o bean </w:t>
-      </w:r>
-      <w:r>
-        <w:rPr>
-          <w:rFonts w:ascii="Consolas" w:hAnsi="Consolas"/>
-          <w:b w:val="0"/>
-          <w:sz w:val="19"/>
-        </w:rPr>
-        <w:t>PasswordEncoder</w:t>
-      </w:r>
-      <w:r>
-        <w:rPr>
-          <w:b w:val="0"/>
-        </w:rPr>
-        <w:t xml:space="preserve"> é um </w:t>
+        <w:t xml:space="preserve"> define quem acessa o quê, libera o endereço do front no CORS e registra o </w:t>
       </w:r>
       <w:r>
         <w:rPr>
@@ -2087,22 +1305,14 @@
         <w:rPr>
           <w:b w:val="0"/>
         </w:rPr>
-        <w:t>. Nenhuma senha é guardada em texto puro.</w:t>
-      </w:r>
-    </w:p>
-    <w:p>
-      <w:r>
-        <w:rPr>
-          <w:b w:val="0"/>
-        </w:rPr>
-        <w:t>O CSRF está desabilitado porque o front é uma SPA separada que ainda não envia token CSRF. É uma simplificação consciente de projeto de faculdade, não um descuido.</w:t>
+        <w:t>, usado para gravar a senha com hash.</w:t>
       </w:r>
     </w:p>
     <w:p>
       <w:r>
         <w:rPr>
           <w:rFonts w:ascii="Consolas" w:hAnsi="Consolas"/>
-          <w:b/>
+          <w:b w:val="0"/>
           <w:sz w:val="19"/>
         </w:rPr>
         <w:t>ApiExceptionHandler</w:t>
@@ -2111,56 +1321,12 @@
         <w:rPr>
           <w:b w:val="0"/>
         </w:rPr>
-        <w:t xml:space="preserve"> é um </w:t>
+        <w:t xml:space="preserve"> transforma os erros em um JSON simples com a mensagem, e </w:t>
       </w:r>
       <w:r>
         <w:rPr>
           <w:rFonts w:ascii="Consolas" w:hAnsi="Consolas"/>
           <w:b w:val="0"/>
-          <w:sz w:val="19"/>
-        </w:rPr>
-        <w:t>@RestControllerAdvice</w:t>
-      </w:r>
-      <w:r>
-        <w:rPr>
-          <w:b w:val="0"/>
-        </w:rPr>
-        <w:t xml:space="preserve">: converte </w:t>
-      </w:r>
-      <w:r>
-        <w:rPr>
-          <w:rFonts w:ascii="Consolas" w:hAnsi="Consolas"/>
-          <w:b w:val="0"/>
-          <w:sz w:val="19"/>
-        </w:rPr>
-        <w:t>ResponseStatusException</w:t>
-      </w:r>
-      <w:r>
-        <w:rPr>
-          <w:b w:val="0"/>
-        </w:rPr>
-        <w:t xml:space="preserve"> em um corpo enxuto </w:t>
-      </w:r>
-      <w:r>
-        <w:rPr>
-          <w:rFonts w:ascii="Consolas" w:hAnsi="Consolas"/>
-          <w:b w:val="0"/>
-          <w:sz w:val="19"/>
-        </w:rPr>
-        <w:t>{"message": "..."}</w:t>
-      </w:r>
-      <w:r>
-        <w:rPr>
-          <w:b w:val="0"/>
-        </w:rPr>
-        <w:t>, que é o que o front sabe exibir.</w:t>
-      </w:r>
-    </w:p>
-    <w:p>
-      <w:r>
-        <w:rPr>
-          <w:rFonts w:ascii="Consolas" w:hAnsi="Consolas"/>
-          <w:b/>
           <w:sz w:val="19"/>
         </w:rPr>
         <w:t>DatabaseUserDetailsService</w:t>
@@ -2169,63 +1335,7 @@
         <w:rPr>
           <w:b w:val="0"/>
         </w:rPr>
-        <w:t xml:space="preserve"> é a ponte entre o nosso </w:t>
-      </w:r>
-      <w:r>
-        <w:rPr>
-          <w:rFonts w:ascii="Consolas" w:hAnsi="Consolas"/>
-          <w:b w:val="0"/>
-          <w:sz w:val="19"/>
-        </w:rPr>
-        <w:t>User</w:t>
-      </w:r>
-      <w:r>
-        <w:rPr>
-          <w:b w:val="0"/>
-        </w:rPr>
-        <w:t xml:space="preserve"> e o Spring Security: dado um e-mail, devolve um </w:t>
-      </w:r>
-      <w:r>
-        <w:rPr>
-          <w:rFonts w:ascii="Consolas" w:hAnsi="Consolas"/>
-          <w:b w:val="0"/>
-          <w:sz w:val="19"/>
-        </w:rPr>
-        <w:t>UserDetails</w:t>
-      </w:r>
-      <w:r>
-        <w:rPr>
-          <w:b w:val="0"/>
-        </w:rPr>
-        <w:t xml:space="preserve"> com o hash da senha e o papel no formato que o framework espera (</w:t>
-      </w:r>
-      <w:r>
-        <w:rPr>
-          <w:rFonts w:ascii="Consolas" w:hAnsi="Consolas"/>
-          <w:b w:val="0"/>
-          <w:sz w:val="19"/>
-        </w:rPr>
-        <w:t>ROLE_ADMIN</w:t>
-      </w:r>
-      <w:r>
-        <w:rPr>
-          <w:b w:val="0"/>
-        </w:rPr>
-        <w:t xml:space="preserve">, </w:t>
-      </w:r>
-      <w:r>
-        <w:rPr>
-          <w:rFonts w:ascii="Consolas" w:hAnsi="Consolas"/>
-          <w:b w:val="0"/>
-          <w:sz w:val="19"/>
-        </w:rPr>
-        <w:t>ROLE_USER</w:t>
-      </w:r>
-      <w:r>
-        <w:rPr>
-          <w:b w:val="0"/>
-        </w:rPr>
-        <w:t>).</w:t>
+        <w:t xml:space="preserve"> ensina o Spring Security a buscar o usuário na nossa tabela.</w:t>
       </w:r>
     </w:p>
     <w:p>
@@ -2237,93 +1347,29 @@
       </w:r>
     </w:p>
     <w:p>
-      <w:r>
-        <w:rPr>
-          <w:b w:val="0"/>
-        </w:rPr>
-        <w:t>O front é uma SPA em React, construída com Vite, escrita em JSX + CSS puro — sem biblioteca de componentes nem de estilo.</w:t>
-      </w:r>
-    </w:p>
-    <w:p>
       <w:pPr>
         <w:pStyle w:val="Codigo"/>
       </w:pPr>
       <w:r>
         <w:t>frontend/src/</w:t>
         <w:br/>
-        <w:t>├── main.jsx               ponto de entrada: monta o React e carrega o CSS global</w:t>
+        <w:t>├── main.jsx        inicia o React e carrega o CSS global</w:t>
         <w:br/>
-        <w:t>├── App.jsx                casca da aplicação e troca de página</w:t>
+        <w:t>├── App.jsx         troca de página</w:t>
         <w:br/>
-        <w:t>│</w:t>
+        <w:t>├── pages/          telas inteiras: MainPage e BookRegistration</w:t>
         <w:br/>
-        <w:t>├── pages/                 uma tela inteira, junta os componentes e guarda o estado</w:t>
+        <w:t>├── components/     peças da tela (Header, SearchBar, Filters, BooksCatalog,</w:t>
         <w:br/>
-        <w:t>│   ├── MainPage.jsx       acervo: busca + filtros + catálogo + detalhe</w:t>
+        <w:t>│                   BooksInfo, DefaultInfo, BookForm, AccountMenu)</w:t>
         <w:br/>
-        <w:t>│   └── BookRegistration.jsx  formulário de cadastro de obra</w:t>
+        <w:t>├── api/            chamadas ao back-end (auth.js)</w:t>
         <w:br/>
-        <w:t>│</w:t>
+        <w:t>├── data/           dados de exemplo</w:t>
         <w:br/>
-        <w:t>├── components/            peças reutilizáveis, só .jsx</w:t>
+        <w:t>├── styles/         todo o CSS</w:t>
         <w:br/>
-        <w:t>│   ├── Header.jsx         cabeçalho: título, data e navegação</w:t>
-        <w:br/>
-        <w:t>│   ├── SearchBar.jsx      campo de busca</w:t>
-        <w:br/>
-        <w:t>│   ├── Filters.jsx        os cinco filtros</w:t>
-        <w:br/>
-        <w:t>│   ├── BooksCatalog.jsx   lista de obras</w:t>
-        <w:br/>
-        <w:t>│   ├── BooksInfo.jsx      painel de detalhes da obra selecionada</w:t>
-        <w:br/>
-        <w:t>│   ├── DefaultInfo.jsx    painel exibido quando nada está selecionado</w:t>
-        <w:br/>
-        <w:t>│   ├── BookForm.jsx       formulário da obra</w:t>
-        <w:br/>
-        <w:t>│   ├── AccountMenu.jsx    menu de conta (login / cadastro / sair)</w:t>
-        <w:br/>
-        <w:t>│   └── index.js           reexporta tudo: import { X } from "../components"</w:t>
-        <w:br/>
-        <w:t>│</w:t>
-        <w:br/>
-        <w:t>├── api/                   acesso ao back-end</w:t>
-        <w:br/>
-        <w:t>│   └── auth.js            login() e register()</w:t>
-        <w:br/>
-        <w:t>│</w:t>
-        <w:br/>
-        <w:t>├── data/                  dados de exemplo enquanto a API de livros não existe</w:t>
-        <w:br/>
-        <w:t>│   ├── books-mock.js</w:t>
-        <w:br/>
-        <w:t>│   └── filter-options.js</w:t>
-        <w:br/>
-        <w:t>│</w:t>
-        <w:br/>
-        <w:t>├── styles/                todo o CSS, separado do JSX</w:t>
-        <w:br/>
-        <w:t>│   ├── tokens.css         variáveis de cor e fonte (:root)</w:t>
-        <w:br/>
-        <w:t>│   ├── base.css           reset e estilo dos elementos base</w:t>
-        <w:br/>
-        <w:t>│   ├── panel.css          .panel — caixa usada por vários componentes</w:t>
-        <w:br/>
-        <w:t>│   ├── App.css            estilos da casca</w:t>
-        <w:br/>
-        <w:t>│   └── &lt;Componente&gt;.css   um arquivo por componente ou página</w:t>
-        <w:br/>
-        <w:t>│</w:t>
-        <w:br/>
-        <w:t>└── assets/                imagens</w:t>
-      </w:r>
-    </w:p>
-    <w:p>
-      <w:pPr>
-        <w:pStyle w:val="Heading3"/>
-      </w:pPr>
-      <w:r>
-        <w:t>3.1 Organização do CSS</w:t>
+        <w:t>└── assets/         imagens</w:t>
       </w:r>
     </w:p>
     <w:p>
@@ -2331,25 +1377,63 @@
         <w:rPr>
           <w:b w:val="0"/>
         </w:rPr>
-        <w:t>Cada arquivo de estilo tem o nome do componente ou da página a que pertence, e é importado por ele:</w:t>
+        <w:t xml:space="preserve">Cada componente tem um arquivo de CSS com o mesmo nome em </w:t>
       </w:r>
-    </w:p>
-    <w:p>
-      <w:pPr>
-        <w:pStyle w:val="Codigo"/>
-      </w:pPr>
       <w:r>
-        <w:t>// components/SearchBar.jsx</w:t>
-        <w:br/>
-        <w:t>import "../styles/SearchBar.css";</w:t>
+        <w:rPr>
+          <w:rFonts w:ascii="Consolas" w:hAnsi="Consolas"/>
+          <w:b w:val="0"/>
+          <w:sz w:val="19"/>
+        </w:rPr>
+        <w:t>styles/</w:t>
       </w:r>
-    </w:p>
-    <w:p>
       <w:r>
         <w:rPr>
           <w:b w:val="0"/>
         </w:rPr>
-        <w:t xml:space="preserve">Três arquivos fogem dessa regra por serem globais e são carregados uma única vez no </w:t>
+        <w:t>, importado por ele. Os arquivos globais (</w:t>
+      </w:r>
+      <w:r>
+        <w:rPr>
+          <w:rFonts w:ascii="Consolas" w:hAnsi="Consolas"/>
+          <w:b w:val="0"/>
+          <w:sz w:val="19"/>
+        </w:rPr>
+        <w:t>tokens.css</w:t>
+      </w:r>
+      <w:r>
+        <w:rPr>
+          <w:b w:val="0"/>
+        </w:rPr>
+        <w:t xml:space="preserve"> com as cores e fontes, </w:t>
+      </w:r>
+      <w:r>
+        <w:rPr>
+          <w:rFonts w:ascii="Consolas" w:hAnsi="Consolas"/>
+          <w:b w:val="0"/>
+          <w:sz w:val="19"/>
+        </w:rPr>
+        <w:t>base.css</w:t>
+      </w:r>
+      <w:r>
+        <w:rPr>
+          <w:b w:val="0"/>
+        </w:rPr>
+        <w:t xml:space="preserve"> com o reset e </w:t>
+      </w:r>
+      <w:r>
+        <w:rPr>
+          <w:rFonts w:ascii="Consolas" w:hAnsi="Consolas"/>
+          <w:b w:val="0"/>
+          <w:sz w:val="19"/>
+        </w:rPr>
+        <w:t>panel.css</w:t>
+      </w:r>
+      <w:r>
+        <w:rPr>
+          <w:b w:val="0"/>
+        </w:rPr>
+        <w:t xml:space="preserve">) são carregados no </w:t>
       </w:r>
       <w:r>
         <w:rPr>
@@ -2363,49 +1447,7 @@
         <w:rPr>
           <w:b w:val="0"/>
         </w:rPr>
-        <w:t>:</w:t>
-      </w:r>
-    </w:p>
-    <w:p>
-      <w:pPr>
-        <w:pStyle w:val="ListBullet"/>
-        <w:spacing w:after="80"/>
-        <w:ind w:left="432"/>
-      </w:pPr>
-      <w:r>
-        <w:rPr>
-          <w:rFonts w:ascii="Consolas" w:hAnsi="Consolas"/>
-          <w:b w:val="0"/>
-          <w:sz w:val="19"/>
-        </w:rPr>
-        <w:t>tokens.css</w:t>
-      </w:r>
-      <w:r>
-        <w:rPr>
-          <w:b w:val="0"/>
-        </w:rPr>
-        <w:t xml:space="preserve"> — a paleta e as fontes, como variáveis CSS. Trocar a cor do projeto inteiro é editar uma linha aqui.</w:t>
-      </w:r>
-    </w:p>
-    <w:p>
-      <w:pPr>
-        <w:pStyle w:val="ListBullet"/>
-        <w:spacing w:after="80"/>
-        <w:ind w:left="432"/>
-      </w:pPr>
-      <w:r>
-        <w:rPr>
-          <w:rFonts w:ascii="Consolas" w:hAnsi="Consolas"/>
-          <w:b w:val="0"/>
-          <w:sz w:val="19"/>
-        </w:rPr>
-        <w:t>base.css</w:t>
-      </w:r>
-      <w:r>
-        <w:rPr>
-          <w:b w:val="0"/>
-        </w:rPr>
-        <w:t xml:space="preserve"> — o reset e o estilo dos elementos (</w:t>
+        <w:t xml:space="preserve">. As classes seguem o padrão BEM, como </w:t>
       </w:r>
       <w:r>
         <w:rPr>
@@ -2413,112 +1455,7 @@
           <w:b w:val="0"/>
           <w:sz w:val="19"/>
         </w:rPr>
-        <w:t>body</w:t>
-      </w:r>
-      <w:r>
-        <w:rPr>
-          <w:b w:val="0"/>
-        </w:rPr>
-        <w:t xml:space="preserve">, </w:t>
-      </w:r>
-      <w:r>
-        <w:rPr>
-          <w:rFonts w:ascii="Consolas" w:hAnsi="Consolas"/>
-          <w:b w:val="0"/>
-          <w:sz w:val="19"/>
-        </w:rPr>
-        <w:t>h1</w:t>
-      </w:r>
-      <w:r>
-        <w:rPr>
-          <w:b w:val="0"/>
-        </w:rPr>
-        <w:t xml:space="preserve">, </w:t>
-      </w:r>
-      <w:r>
-        <w:rPr>
-          <w:rFonts w:ascii="Consolas" w:hAnsi="Consolas"/>
-          <w:b w:val="0"/>
-          <w:sz w:val="19"/>
-        </w:rPr>
-        <w:t>img</w:t>
-      </w:r>
-      <w:r>
-        <w:rPr>
-          <w:b w:val="0"/>
-        </w:rPr>
-        <w:t>, ...).</w:t>
-      </w:r>
-    </w:p>
-    <w:p>
-      <w:pPr>
-        <w:pStyle w:val="ListBullet"/>
-        <w:spacing w:after="80"/>
-        <w:ind w:left="432"/>
-      </w:pPr>
-      <w:r>
-        <w:rPr>
-          <w:rFonts w:ascii="Consolas" w:hAnsi="Consolas"/>
-          <w:b w:val="0"/>
-          <w:sz w:val="19"/>
-        </w:rPr>
-        <w:t>panel.css</w:t>
-      </w:r>
-      <w:r>
-        <w:rPr>
-          <w:b w:val="0"/>
-        </w:rPr>
-        <w:t xml:space="preserve"> — a classe </w:t>
-      </w:r>
-      <w:r>
-        <w:rPr>
-          <w:rFonts w:ascii="Consolas" w:hAnsi="Consolas"/>
-          <w:b w:val="0"/>
-          <w:sz w:val="19"/>
-        </w:rPr>
-        <w:t>.panel</w:t>
-      </w:r>
-      <w:r>
-        <w:rPr>
-          <w:b w:val="0"/>
-        </w:rPr>
-        <w:t xml:space="preserve">, compartilhada por </w:t>
-      </w:r>
-      <w:r>
-        <w:rPr>
-          <w:rFonts w:ascii="Consolas" w:hAnsi="Consolas"/>
-          <w:b w:val="0"/>
-          <w:sz w:val="19"/>
-        </w:rPr>
-        <w:t>BooksInfo</w:t>
-      </w:r>
-      <w:r>
-        <w:rPr>
-          <w:b w:val="0"/>
-        </w:rPr>
-        <w:t xml:space="preserve">, </w:t>
-      </w:r>
-      <w:r>
-        <w:rPr>
-          <w:rFonts w:ascii="Consolas" w:hAnsi="Consolas"/>
-          <w:b w:val="0"/>
-          <w:sz w:val="19"/>
-        </w:rPr>
-        <w:t>DefaultInfo</w:t>
-      </w:r>
-      <w:r>
-        <w:rPr>
-          <w:b w:val="0"/>
-        </w:rPr>
-        <w:t xml:space="preserve"> e </w:t>
-      </w:r>
-      <w:r>
-        <w:rPr>
-          <w:rFonts w:ascii="Consolas" w:hAnsi="Consolas"/>
-          <w:b w:val="0"/>
-          <w:sz w:val="19"/>
-        </w:rPr>
-        <w:t>AccountMenu</w:t>
+        <w:t>.book-card__title</w:t>
       </w:r>
       <w:r>
         <w:rPr>
@@ -2532,196 +1469,7 @@
         <w:rPr>
           <w:b w:val="0"/>
         </w:rPr>
-        <w:t xml:space="preserve">Os nomes de classe seguem a convenção </w:t>
-      </w:r>
-      <w:r>
-        <w:rPr>
-          <w:b/>
-        </w:rPr>
-        <w:t>BEM</w:t>
-      </w:r>
-      <w:r>
-        <w:rPr>
-          <w:b w:val="0"/>
-        </w:rPr>
-        <w:t xml:space="preserve"> (</w:t>
-      </w:r>
-      <w:r>
-        <w:rPr>
-          <w:rFonts w:ascii="Consolas" w:hAnsi="Consolas"/>
-          <w:b w:val="0"/>
-          <w:sz w:val="19"/>
-        </w:rPr>
-        <w:t>bloco__elemento--modificador</w:t>
-      </w:r>
-      <w:r>
-        <w:rPr>
-          <w:b w:val="0"/>
-        </w:rPr>
-        <w:t xml:space="preserve">, como </w:t>
-      </w:r>
-      <w:r>
-        <w:rPr>
-          <w:rFonts w:ascii="Consolas" w:hAnsi="Consolas"/>
-          <w:b w:val="0"/>
-          <w:sz w:val="19"/>
-        </w:rPr>
-        <w:t>.book-card__title</w:t>
-      </w:r>
-      <w:r>
-        <w:rPr>
-          <w:b w:val="0"/>
-        </w:rPr>
-        <w:t xml:space="preserve"> e </w:t>
-      </w:r>
-      <w:r>
-        <w:rPr>
-          <w:rFonts w:ascii="Consolas" w:hAnsi="Consolas"/>
-          <w:b w:val="0"/>
-          <w:sz w:val="19"/>
-        </w:rPr>
-        <w:t>.book-card--selected</w:t>
-      </w:r>
-      <w:r>
-        <w:rPr>
-          <w:b w:val="0"/>
-        </w:rPr>
-        <w:t>). Como o CSS aqui é global, é o prefixo do bloco que garante que dois componentes não colidam.</w:t>
-      </w:r>
-    </w:p>
-    <w:p>
-      <w:pPr>
-        <w:pStyle w:val="Heading3"/>
-      </w:pPr>
-      <w:r>
-        <w:t>3.2 Estado e fluxo de dados</w:t>
-      </w:r>
-    </w:p>
-    <w:p>
-      <w:r>
-        <w:rPr>
-          <w:b w:val="0"/>
-        </w:rPr>
-        <w:t>Não há Redux nem Context: o estado mora no componente-pai mais próximo que precisa dele, e desce por props.</w:t>
-      </w:r>
-    </w:p>
-    <w:p>
-      <w:pPr>
-        <w:pStyle w:val="ListBullet"/>
-        <w:spacing w:after="80"/>
-        <w:ind w:left="432"/>
-      </w:pPr>
-      <w:r>
-        <w:rPr>
-          <w:rFonts w:ascii="Consolas" w:hAnsi="Consolas"/>
-          <w:b w:val="0"/>
-          <w:sz w:val="19"/>
-        </w:rPr>
-        <w:t>App</w:t>
-      </w:r>
-      <w:r>
-        <w:rPr>
-          <w:b w:val="0"/>
-        </w:rPr>
-        <w:t xml:space="preserve"> guarda a página atual e o usuário logado. Entrega as duas coisas ao </w:t>
-      </w:r>
-      <w:r>
-        <w:rPr>
-          <w:rFonts w:ascii="Consolas" w:hAnsi="Consolas"/>
-          <w:b w:val="0"/>
-          <w:sz w:val="19"/>
-        </w:rPr>
-        <w:t>Header</w:t>
-      </w:r>
-      <w:r>
-        <w:rPr>
-          <w:b w:val="0"/>
-        </w:rPr>
-        <w:t xml:space="preserve">: o usuário, que ele repassa ao </w:t>
-      </w:r>
-      <w:r>
-        <w:rPr>
-          <w:rFonts w:ascii="Consolas" w:hAnsi="Consolas"/>
-          <w:b w:val="0"/>
-          <w:sz w:val="19"/>
-        </w:rPr>
-        <w:t>AccountMenu</w:t>
-      </w:r>
-      <w:r>
-        <w:rPr>
-          <w:b w:val="0"/>
-        </w:rPr>
-        <w:t xml:space="preserve">, e a página atual mais o </w:t>
-      </w:r>
-      <w:r>
-        <w:rPr>
-          <w:rFonts w:ascii="Consolas" w:hAnsi="Consolas"/>
-          <w:b w:val="0"/>
-          <w:sz w:val="19"/>
-        </w:rPr>
-        <w:t>onNavigate</w:t>
-      </w:r>
-      <w:r>
-        <w:rPr>
-          <w:b w:val="0"/>
-        </w:rPr>
-        <w:t>, que os botões do menu usam para trocar de tela.</w:t>
-      </w:r>
-    </w:p>
-    <w:p>
-      <w:pPr>
-        <w:pStyle w:val="ListBullet"/>
-        <w:spacing w:after="80"/>
-        <w:ind w:left="432"/>
-      </w:pPr>
-      <w:r>
-        <w:rPr>
-          <w:rFonts w:ascii="Consolas" w:hAnsi="Consolas"/>
-          <w:b w:val="0"/>
-          <w:sz w:val="19"/>
-        </w:rPr>
-        <w:t>MainPage</w:t>
-      </w:r>
-      <w:r>
-        <w:rPr>
-          <w:b w:val="0"/>
-        </w:rPr>
-        <w:t xml:space="preserve"> guarda o termo de busca, os filtros e a obra selecionada, calcula a lista visível e a entrega pronta ao </w:t>
-      </w:r>
-      <w:r>
-        <w:rPr>
-          <w:rFonts w:ascii="Consolas" w:hAnsi="Consolas"/>
-          <w:b w:val="0"/>
-          <w:sz w:val="19"/>
-        </w:rPr>
-        <w:t>BooksCatalog</w:t>
-      </w:r>
-      <w:r>
-        <w:rPr>
-          <w:b w:val="0"/>
-        </w:rPr>
-        <w:t>.</w:t>
-      </w:r>
-    </w:p>
-    <w:p>
-      <w:pPr>
-        <w:pStyle w:val="ListBullet"/>
-        <w:spacing w:after="80"/>
-        <w:ind w:left="432"/>
-      </w:pPr>
-      <w:r>
-        <w:rPr>
-          <w:rFonts w:ascii="Consolas" w:hAnsi="Consolas"/>
-          <w:b w:val="0"/>
-          <w:sz w:val="19"/>
-        </w:rPr>
-        <w:t>AccountMenu</w:t>
-      </w:r>
-      <w:r>
-        <w:rPr>
-          <w:b w:val="0"/>
-        </w:rPr>
-        <w:t xml:space="preserve"> guarda o formulário de login e avisa o </w:t>
+        <w:t xml:space="preserve">O estado fica no componente pai que precisa dele e desce por props. O </w:t>
       </w:r>
       <w:r>
         <w:rPr>
@@ -2735,7 +1483,7 @@
         <w:rPr>
           <w:b w:val="0"/>
         </w:rPr>
-        <w:t xml:space="preserve"> por callback (</w:t>
+        <w:t xml:space="preserve"> guarda a página atual e o usuário logado; a </w:t>
       </w:r>
       <w:r>
         <w:rPr>
@@ -2743,75 +1491,13 @@
           <w:b w:val="0"/>
           <w:sz w:val="19"/>
         </w:rPr>
-        <w:t>onLogin</w:t>
+        <w:t>MainPage</w:t>
       </w:r>
       <w:r>
         <w:rPr>
           <w:b w:val="0"/>
         </w:rPr>
-        <w:t>) quando a autenticação dá certo.</w:t>
-      </w:r>
-    </w:p>
-    <w:p>
-      <w:r>
-        <w:rPr>
-          <w:b w:val="0"/>
-        </w:rPr>
-        <w:t xml:space="preserve">Os componentes de </w:t>
-      </w:r>
-      <w:r>
-        <w:rPr>
-          <w:rFonts w:ascii="Consolas" w:hAnsi="Consolas"/>
-          <w:b w:val="0"/>
-          <w:sz w:val="19"/>
-        </w:rPr>
-        <w:t>components/</w:t>
-      </w:r>
-      <w:r>
-        <w:rPr>
-          <w:b w:val="0"/>
-        </w:rPr>
-        <w:t xml:space="preserve"> são, em sua maioria, </w:t>
-      </w:r>
-      <w:r>
-        <w:rPr>
-          <w:b/>
-        </w:rPr>
-        <w:t>de apresentação</w:t>
-      </w:r>
-      <w:r>
-        <w:rPr>
-          <w:b w:val="0"/>
-        </w:rPr>
-        <w:t xml:space="preserve">: recebem dados e callbacks por props e não buscam nada sozinhos. A exceção é o </w:t>
-      </w:r>
-      <w:r>
-        <w:rPr>
-          <w:rFonts w:ascii="Consolas" w:hAnsi="Consolas"/>
-          <w:b w:val="0"/>
-          <w:sz w:val="19"/>
-        </w:rPr>
-        <w:t>AccountMenu</w:t>
-      </w:r>
-      <w:r>
-        <w:rPr>
-          <w:b w:val="0"/>
-        </w:rPr>
-        <w:t xml:space="preserve">, que chama </w:t>
-      </w:r>
-      <w:r>
-        <w:rPr>
-          <w:rFonts w:ascii="Consolas" w:hAnsi="Consolas"/>
-          <w:b w:val="0"/>
-          <w:sz w:val="19"/>
-        </w:rPr>
-        <w:t>api/auth.js</w:t>
-      </w:r>
-      <w:r>
-        <w:rPr>
-          <w:b w:val="0"/>
-        </w:rPr>
-        <w:t xml:space="preserve"> diretamente.</w:t>
+        <w:t xml:space="preserve"> guarda a busca, os filtros e o livro selecionado.</w:t>
       </w:r>
     </w:p>
     <w:p>
@@ -2827,7 +1513,7 @@
         <w:rPr>
           <w:b w:val="0"/>
         </w:rPr>
-        <w:t>As duas entidades do banco, com o enum do papel do usuário. Cada classe corresponde a uma tabela criada pelas migrações do Flyway.</w:t>
+        <w:t>As duas entidades do banco e o enum do papel do usuário.</w:t>
       </w:r>
     </w:p>
     <w:p>
@@ -2881,312 +1567,6 @@
         <w:t>Diagrama de classes do back-end</w:t>
       </w:r>
     </w:p>
-    <w:tbl>
-      <w:tblPr>
-        <w:tblStyle w:val="LightGrid-Accent1"/>
-        <w:tblW w:type="auto" w:w="0"/>
-        <w:jc w:val="center"/>
-        <w:tblLook w:firstColumn="1" w:firstRow="1" w:lastColumn="0" w:lastRow="0" w:noHBand="0" w:noVBand="1" w:val="04A0"/>
-      </w:tblPr>
-      <w:tblGrid>
-        <w:gridCol w:w="2880"/>
-        <w:gridCol w:w="2880"/>
-        <w:gridCol w:w="2880"/>
-      </w:tblGrid>
-      <w:tr>
-        <w:tc>
-          <w:tcPr>
-            <w:tcW w:type="dxa" w:w="2880"/>
-          </w:tcPr>
-          <w:p>
-            <w:pPr>
-              <w:spacing w:after="40"/>
-            </w:pPr>
-            <w:r>
-              <w:rPr>
-                <w:sz w:val="19"/>
-              </w:rPr>
-            </w:r>
-            <w:r>
-              <w:rPr>
-                <w:b/>
-                <w:sz w:val="19"/>
-              </w:rPr>
-              <w:t>Classe</w:t>
-            </w:r>
-          </w:p>
-        </w:tc>
-        <w:tc>
-          <w:tcPr>
-            <w:tcW w:type="dxa" w:w="2880"/>
-          </w:tcPr>
-          <w:p>
-            <w:pPr>
-              <w:spacing w:after="40"/>
-            </w:pPr>
-            <w:r>
-              <w:rPr>
-                <w:sz w:val="19"/>
-              </w:rPr>
-            </w:r>
-            <w:r>
-              <w:rPr>
-                <w:b/>
-                <w:sz w:val="19"/>
-              </w:rPr>
-              <w:t>Tabela</w:t>
-            </w:r>
-          </w:p>
-        </w:tc>
-        <w:tc>
-          <w:tcPr>
-            <w:tcW w:type="dxa" w:w="2880"/>
-          </w:tcPr>
-          <w:p>
-            <w:pPr>
-              <w:spacing w:after="40"/>
-            </w:pPr>
-            <w:r>
-              <w:rPr>
-                <w:sz w:val="19"/>
-              </w:rPr>
-            </w:r>
-            <w:r>
-              <w:rPr>
-                <w:b/>
-                <w:sz w:val="19"/>
-              </w:rPr>
-              <w:t>Observações</w:t>
-            </w:r>
-          </w:p>
-        </w:tc>
-      </w:tr>
-      <w:tr>
-        <w:tc>
-          <w:tcPr>
-            <w:tcW w:type="dxa" w:w="2880"/>
-          </w:tcPr>
-          <w:p>
-            <w:pPr>
-              <w:spacing w:after="40"/>
-            </w:pPr>
-            <w:r>
-              <w:rPr>
-                <w:sz w:val="19"/>
-              </w:rPr>
-            </w:r>
-            <w:r>
-              <w:rPr>
-                <w:rFonts w:ascii="Consolas" w:hAnsi="Consolas"/>
-                <w:b w:val="0"/>
-                <w:sz w:val="19"/>
-              </w:rPr>
-              <w:t>User</w:t>
-            </w:r>
-          </w:p>
-        </w:tc>
-        <w:tc>
-          <w:tcPr>
-            <w:tcW w:type="dxa" w:w="2880"/>
-          </w:tcPr>
-          <w:p>
-            <w:pPr>
-              <w:spacing w:after="40"/>
-            </w:pPr>
-            <w:r>
-              <w:rPr>
-                <w:sz w:val="19"/>
-              </w:rPr>
-            </w:r>
-            <w:r>
-              <w:rPr>
-                <w:rFonts w:ascii="Consolas" w:hAnsi="Consolas"/>
-                <w:b w:val="0"/>
-                <w:sz w:val="19"/>
-              </w:rPr>
-              <w:t>users</w:t>
-            </w:r>
-          </w:p>
-        </w:tc>
-        <w:tc>
-          <w:tcPr>
-            <w:tcW w:type="dxa" w:w="2880"/>
-          </w:tcPr>
-          <w:p>
-            <w:pPr>
-              <w:spacing w:after="40"/>
-            </w:pPr>
-            <w:r>
-              <w:rPr>
-                <w:sz w:val="19"/>
-              </w:rPr>
-            </w:r>
-            <w:r>
-              <w:rPr>
-                <w:rFonts w:ascii="Consolas" w:hAnsi="Consolas"/>
-                <w:b w:val="0"/>
-                <w:sz w:val="19"/>
-              </w:rPr>
-              <w:t>email</w:t>
-            </w:r>
-            <w:r>
-              <w:rPr>
-                <w:b w:val="0"/>
-                <w:sz w:val="19"/>
-              </w:rPr>
-              <w:t xml:space="preserve"> é único; </w:t>
-            </w:r>
-            <w:r>
-              <w:rPr>
-                <w:rFonts w:ascii="Consolas" w:hAnsi="Consolas"/>
-                <w:b w:val="0"/>
-                <w:sz w:val="19"/>
-              </w:rPr>
-              <w:t>password</w:t>
-            </w:r>
-            <w:r>
-              <w:rPr>
-                <w:b w:val="0"/>
-                <w:sz w:val="19"/>
-              </w:rPr>
-              <w:t xml:space="preserve"> guarda o hash BCrypt; </w:t>
-            </w:r>
-            <w:r>
-              <w:rPr>
-                <w:rFonts w:ascii="Consolas" w:hAnsi="Consolas"/>
-                <w:b w:val="0"/>
-                <w:sz w:val="19"/>
-              </w:rPr>
-              <w:t>role</w:t>
-            </w:r>
-            <w:r>
-              <w:rPr>
-                <w:b w:val="0"/>
-                <w:sz w:val="19"/>
-              </w:rPr>
-              <w:t xml:space="preserve"> é gravado como texto (</w:t>
-            </w:r>
-            <w:r>
-              <w:rPr>
-                <w:rFonts w:ascii="Consolas" w:hAnsi="Consolas"/>
-                <w:b w:val="0"/>
-                <w:sz w:val="19"/>
-              </w:rPr>
-              <w:t>USER</w:t>
-            </w:r>
-            <w:r>
-              <w:rPr>
-                <w:b w:val="0"/>
-                <w:sz w:val="19"/>
-              </w:rPr>
-              <w:t xml:space="preserve"> / </w:t>
-            </w:r>
-            <w:r>
-              <w:rPr>
-                <w:rFonts w:ascii="Consolas" w:hAnsi="Consolas"/>
-                <w:b w:val="0"/>
-                <w:sz w:val="19"/>
-              </w:rPr>
-              <w:t>ADMIN</w:t>
-            </w:r>
-            <w:r>
-              <w:rPr>
-                <w:b w:val="0"/>
-                <w:sz w:val="19"/>
-              </w:rPr>
-              <w:t>)</w:t>
-            </w:r>
-          </w:p>
-        </w:tc>
-      </w:tr>
-      <w:tr>
-        <w:tc>
-          <w:tcPr>
-            <w:tcW w:type="dxa" w:w="2880"/>
-          </w:tcPr>
-          <w:p>
-            <w:pPr>
-              <w:spacing w:after="40"/>
-            </w:pPr>
-            <w:r>
-              <w:rPr>
-                <w:sz w:val="19"/>
-              </w:rPr>
-            </w:r>
-            <w:r>
-              <w:rPr>
-                <w:rFonts w:ascii="Consolas" w:hAnsi="Consolas"/>
-                <w:b w:val="0"/>
-                <w:sz w:val="19"/>
-              </w:rPr>
-              <w:t>Book</w:t>
-            </w:r>
-          </w:p>
-        </w:tc>
-        <w:tc>
-          <w:tcPr>
-            <w:tcW w:type="dxa" w:w="2880"/>
-          </w:tcPr>
-          <w:p>
-            <w:pPr>
-              <w:spacing w:after="40"/>
-            </w:pPr>
-            <w:r>
-              <w:rPr>
-                <w:sz w:val="19"/>
-              </w:rPr>
-            </w:r>
-            <w:r>
-              <w:rPr>
-                <w:rFonts w:ascii="Consolas" w:hAnsi="Consolas"/>
-                <w:b w:val="0"/>
-                <w:sz w:val="19"/>
-              </w:rPr>
-              <w:t>books</w:t>
-            </w:r>
-          </w:p>
-        </w:tc>
-        <w:tc>
-          <w:tcPr>
-            <w:tcW w:type="dxa" w:w="2880"/>
-          </w:tcPr>
-          <w:p>
-            <w:pPr>
-              <w:spacing w:after="40"/>
-            </w:pPr>
-            <w:r>
-              <w:rPr>
-                <w:sz w:val="19"/>
-              </w:rPr>
-            </w:r>
-            <w:r>
-              <w:rPr>
-                <w:rFonts w:ascii="Consolas" w:hAnsi="Consolas"/>
-                <w:b w:val="0"/>
-                <w:sz w:val="19"/>
-              </w:rPr>
-              <w:t>cover_url</w:t>
-            </w:r>
-            <w:r>
-              <w:rPr>
-                <w:b w:val="0"/>
-                <w:sz w:val="19"/>
-              </w:rPr>
-              <w:t xml:space="preserve"> é o único campo opcional; há índice por </w:t>
-            </w:r>
-            <w:r>
-              <w:rPr>
-                <w:rFonts w:ascii="Consolas" w:hAnsi="Consolas"/>
-                <w:b w:val="0"/>
-                <w:sz w:val="19"/>
-              </w:rPr>
-              <w:t>genre</w:t>
-            </w:r>
-          </w:p>
-        </w:tc>
-      </w:tr>
-    </w:tbl>
-    <w:p/>
     <w:p>
       <w:r>
         <w:rPr>
@@ -3200,7 +1580,21 @@
         <w:rPr>
           <w:b w:val="0"/>
         </w:rPr>
-        <w:t xml:space="preserve"> e </w:t>
+        <w:t xml:space="preserve"> vira a tabela </w:t>
+      </w:r>
+      <w:r>
+        <w:rPr>
+          <w:rFonts w:ascii="Consolas" w:hAnsi="Consolas"/>
+          <w:b w:val="0"/>
+          <w:sz w:val="19"/>
+        </w:rPr>
+        <w:t>users</w:t>
+      </w:r>
+      <w:r>
+        <w:rPr>
+          <w:b w:val="0"/>
+        </w:rPr>
+        <w:t xml:space="preserve">, com o e-mail único e a senha gravada em hash. </w:t>
       </w:r>
       <w:r>
         <w:rPr>
@@ -3214,7 +1608,21 @@
         <w:rPr>
           <w:b w:val="0"/>
         </w:rPr>
-        <w:t xml:space="preserve"> ainda não se relacionam: o acervo não registra quem cadastrou a obra, e a tabela de avaliações — que ligaria as duas — ainda não existe.</w:t>
+        <w:t xml:space="preserve"> vira a tabela </w:t>
+      </w:r>
+      <w:r>
+        <w:rPr>
+          <w:rFonts w:ascii="Consolas" w:hAnsi="Consolas"/>
+          <w:b w:val="0"/>
+          <w:sz w:val="19"/>
+        </w:rPr>
+        <w:t>books</w:t>
+      </w:r>
+      <w:r>
+        <w:rPr>
+          <w:b w:val="0"/>
+        </w:rPr>
+        <w:t>, onde só a capa é opcional. As duas ainda não se relacionam, porque a tabela de avaliações não existe.</w:t>
       </w:r>
     </w:p>
     <w:p>
@@ -3222,7 +1630,17 @@
         <w:pStyle w:val="Heading2"/>
       </w:pPr>
       <w:r>
-        <w:t>5. O caminho de uma requisição</w:t>
+        <w:t>5. Como rodar</w:t>
+      </w:r>
+    </w:p>
+    <w:p>
+      <w:pPr>
+        <w:pStyle w:val="Codigo"/>
+      </w:pPr>
+      <w:r>
+        <w:t>./dev.sh          # sobe banco, back-end e front-end</w:t>
+        <w:br/>
+        <w:t>./dev.sh --stop   # para o banco</w:t>
       </w:r>
     </w:p>
     <w:p>
@@ -3230,28 +1648,7 @@
         <w:rPr>
           <w:b w:val="0"/>
         </w:rPr>
-        <w:t>Cadastro de um novo usuário, do clique ao banco:</w:t>
-      </w:r>
-    </w:p>
-    <w:p>
-      <w:pPr>
-        <w:pStyle w:val="ListNumber"/>
-        <w:spacing w:after="80"/>
-        <w:ind w:left="432"/>
-      </w:pPr>
-      <w:r>
-        <w:rPr>
-          <w:rFonts w:ascii="Consolas" w:hAnsi="Consolas"/>
-          <w:b/>
-          <w:sz w:val="19"/>
-        </w:rPr>
-        <w:t>AccountMenu.jsx</w:t>
-      </w:r>
-      <w:r>
-        <w:rPr>
-          <w:b w:val="0"/>
-        </w:rPr>
-        <w:t xml:space="preserve"> — o usuário abre o menu de conta no </w:t>
+        <w:t xml:space="preserve">O site abre em </w:t>
       </w:r>
       <w:r>
         <w:rPr>
@@ -3259,13 +1656,13 @@
           <w:b w:val="0"/>
           <w:sz w:val="19"/>
         </w:rPr>
-        <w:t>Header</w:t>
+        <w:t>http://localhost:5173</w:t>
       </w:r>
       <w:r>
         <w:rPr>
           <w:b w:val="0"/>
         </w:rPr>
-        <w:t xml:space="preserve">, preenche nome, e-mail e senha e envia o formulário. O componente chama </w:t>
+        <w:t xml:space="preserve"> e a API em </w:t>
       </w:r>
       <w:r>
         <w:rPr>
@@ -3273,406 +1670,13 @@
           <w:b w:val="0"/>
           <w:sz w:val="19"/>
         </w:rPr>
-        <w:t>register(...)</w:t>
+        <w:t>http://localhost:8080</w:t>
       </w:r>
       <w:r>
         <w:rPr>
           <w:b w:val="0"/>
         </w:rPr>
-        <w:t>.</w:t>
-      </w:r>
-    </w:p>
-    <w:p>
-      <w:pPr>
-        <w:pStyle w:val="ListNumber"/>
-        <w:spacing w:after="80"/>
-        <w:ind w:left="432"/>
-      </w:pPr>
-      <w:r>
-        <w:rPr>
-          <w:rFonts w:ascii="Consolas" w:hAnsi="Consolas"/>
-          <w:b/>
-          <w:sz w:val="19"/>
-        </w:rPr>
-        <w:t>api/auth.js</w:t>
-      </w:r>
-      <w:r>
-        <w:rPr>
-          <w:b w:val="0"/>
-        </w:rPr>
-        <w:t xml:space="preserve"> — monta o </w:t>
-      </w:r>
-      <w:r>
-        <w:rPr>
-          <w:rFonts w:ascii="Consolas" w:hAnsi="Consolas"/>
-          <w:b w:val="0"/>
-          <w:sz w:val="19"/>
-        </w:rPr>
-        <w:t>fetch</w:t>
-      </w:r>
-      <w:r>
-        <w:rPr>
-          <w:b w:val="0"/>
-        </w:rPr>
-        <w:t xml:space="preserve"> </w:t>
-      </w:r>
-      <w:r>
-        <w:rPr>
-          <w:rFonts w:ascii="Consolas" w:hAnsi="Consolas"/>
-          <w:b w:val="0"/>
-          <w:sz w:val="19"/>
-        </w:rPr>
-        <w:t>POST /api/auth/register</w:t>
-      </w:r>
-      <w:r>
-        <w:rPr>
-          <w:b w:val="0"/>
-        </w:rPr>
-        <w:t xml:space="preserve"> com o corpo em JSON. Se o servidor não responder, lança um erro em português que o componente exibe.</w:t>
-      </w:r>
-    </w:p>
-    <w:p>
-      <w:pPr>
-        <w:pStyle w:val="ListNumber"/>
-        <w:spacing w:after="80"/>
-        <w:ind w:left="432"/>
-      </w:pPr>
-      <w:r>
-        <w:rPr>
-          <w:b/>
-        </w:rPr>
-        <w:t>CORS + Spring Security</w:t>
-      </w:r>
-      <w:r>
-        <w:rPr>
-          <w:b w:val="0"/>
-        </w:rPr>
-        <w:t xml:space="preserve"> — a requisição passa pela cadeia de filtros. A origem </w:t>
-      </w:r>
-      <w:r>
-        <w:rPr>
-          <w:rFonts w:ascii="Consolas" w:hAnsi="Consolas"/>
-          <w:b w:val="0"/>
-          <w:sz w:val="19"/>
-        </w:rPr>
-        <w:t>localhost:5173</w:t>
-      </w:r>
-      <w:r>
-        <w:rPr>
-          <w:b w:val="0"/>
-        </w:rPr>
-        <w:t xml:space="preserve"> está liberada e a rota é pública, então segue.</w:t>
-      </w:r>
-    </w:p>
-    <w:p>
-      <w:pPr>
-        <w:pStyle w:val="ListNumber"/>
-        <w:spacing w:after="80"/>
-        <w:ind w:left="432"/>
-      </w:pPr>
-      <w:r>
-        <w:rPr>
-          <w:rFonts w:ascii="Consolas" w:hAnsi="Consolas"/>
-          <w:b/>
-          <w:sz w:val="19"/>
-        </w:rPr>
-        <w:t>AuthController.register</w:t>
-      </w:r>
-      <w:r>
-        <w:rPr>
-          <w:b w:val="0"/>
-        </w:rPr>
-        <w:t xml:space="preserve"> — o </w:t>
-      </w:r>
-      <w:r>
-        <w:rPr>
-          <w:rFonts w:ascii="Consolas" w:hAnsi="Consolas"/>
-          <w:b w:val="0"/>
-          <w:sz w:val="19"/>
-        </w:rPr>
-        <w:t>@Valid</w:t>
-      </w:r>
-      <w:r>
-        <w:rPr>
-          <w:b w:val="0"/>
-        </w:rPr>
-        <w:t xml:space="preserve"> roda o Bean Validation sobre o </w:t>
-      </w:r>
-      <w:r>
-        <w:rPr>
-          <w:rFonts w:ascii="Consolas" w:hAnsi="Consolas"/>
-          <w:b w:val="0"/>
-          <w:sz w:val="19"/>
-        </w:rPr>
-        <w:t>RegisterRequest</w:t>
-      </w:r>
-      <w:r>
-        <w:rPr>
-          <w:b w:val="0"/>
-        </w:rPr>
-        <w:t xml:space="preserve">. Se o e-mail já existe, lança </w:t>
-      </w:r>
-      <w:r>
-        <w:rPr>
-          <w:rFonts w:ascii="Consolas" w:hAnsi="Consolas"/>
-          <w:b w:val="0"/>
-          <w:sz w:val="19"/>
-        </w:rPr>
-        <w:t>ResponseStatusException</w:t>
-      </w:r>
-      <w:r>
-        <w:rPr>
-          <w:b w:val="0"/>
-        </w:rPr>
-        <w:t xml:space="preserve"> com 409.</w:t>
-      </w:r>
-    </w:p>
-    <w:p>
-      <w:pPr>
-        <w:pStyle w:val="ListNumber"/>
-        <w:spacing w:after="80"/>
-        <w:ind w:left="432"/>
-      </w:pPr>
-      <w:r>
-        <w:rPr>
-          <w:rFonts w:ascii="Consolas" w:hAnsi="Consolas"/>
-          <w:b/>
-          <w:sz w:val="19"/>
-        </w:rPr>
-        <w:t>PasswordEncoder</w:t>
-      </w:r>
-      <w:r>
-        <w:rPr>
-          <w:b w:val="0"/>
-        </w:rPr>
-        <w:t xml:space="preserve"> — a senha vira um hash BCrypt.</w:t>
-      </w:r>
-    </w:p>
-    <w:p>
-      <w:pPr>
-        <w:pStyle w:val="ListNumber"/>
-        <w:spacing w:after="80"/>
-        <w:ind w:left="432"/>
-      </w:pPr>
-      <w:r>
-        <w:rPr>
-          <w:rFonts w:ascii="Consolas" w:hAnsi="Consolas"/>
-          <w:b/>
-          <w:sz w:val="19"/>
-        </w:rPr>
-        <w:t>UserRepository.save</w:t>
-      </w:r>
-      <w:r>
-        <w:rPr>
-          <w:b w:val="0"/>
-        </w:rPr>
-        <w:t xml:space="preserve"> — o Spring Data traduz a chamada em </w:t>
-      </w:r>
-      <w:r>
-        <w:rPr>
-          <w:rFonts w:ascii="Consolas" w:hAnsi="Consolas"/>
-          <w:b w:val="0"/>
-          <w:sz w:val="19"/>
-        </w:rPr>
-        <w:t>INSERT</w:t>
-      </w:r>
-      <w:r>
-        <w:rPr>
-          <w:b w:val="0"/>
-        </w:rPr>
-        <w:t xml:space="preserve"> e o Hibernate a executa contra a tabela </w:t>
-      </w:r>
-      <w:r>
-        <w:rPr>
-          <w:rFonts w:ascii="Consolas" w:hAnsi="Consolas"/>
-          <w:b w:val="0"/>
-          <w:sz w:val="19"/>
-        </w:rPr>
-        <w:t>users</w:t>
-      </w:r>
-      <w:r>
-        <w:rPr>
-          <w:b w:val="0"/>
-        </w:rPr>
-        <w:t>.</w:t>
-      </w:r>
-    </w:p>
-    <w:p>
-      <w:pPr>
-        <w:pStyle w:val="ListNumber"/>
-        <w:spacing w:after="80"/>
-        <w:ind w:left="432"/>
-      </w:pPr>
-      <w:r>
-        <w:rPr>
-          <w:rFonts w:ascii="Consolas" w:hAnsi="Consolas"/>
-          <w:b/>
-          <w:sz w:val="19"/>
-        </w:rPr>
-        <w:t>UserResponse.from(user)</w:t>
-      </w:r>
-      <w:r>
-        <w:rPr>
-          <w:b w:val="0"/>
-        </w:rPr>
-        <w:t xml:space="preserve"> — a entidade é convertida no DTO de saída, sem o campo de senha, e volta como JSON com status 201.</w:t>
-      </w:r>
-    </w:p>
-    <w:p>
-      <w:pPr>
-        <w:pStyle w:val="ListNumber"/>
-        <w:spacing w:after="80"/>
-        <w:ind w:left="432"/>
-      </w:pPr>
-      <w:r>
-        <w:rPr>
-          <w:b w:val="0"/>
-        </w:rPr>
-        <w:t xml:space="preserve">Um erro no caminho seria capturado pelo </w:t>
-      </w:r>
-      <w:r>
-        <w:rPr>
-          <w:rFonts w:ascii="Consolas" w:hAnsi="Consolas"/>
-          <w:b/>
-          <w:sz w:val="19"/>
-        </w:rPr>
-        <w:t>ApiExceptionHandler</w:t>
-      </w:r>
-      <w:r>
-        <w:rPr>
-          <w:b w:val="0"/>
-        </w:rPr>
-        <w:t xml:space="preserve"> e chegaria ao front como </w:t>
-      </w:r>
-      <w:r>
-        <w:rPr>
-          <w:rFonts w:ascii="Consolas" w:hAnsi="Consolas"/>
-          <w:b w:val="0"/>
-          <w:sz w:val="19"/>
-        </w:rPr>
-        <w:t>{"message": "..."}</w:t>
-      </w:r>
-      <w:r>
-        <w:rPr>
-          <w:b w:val="0"/>
-        </w:rPr>
-        <w:t xml:space="preserve">, que o </w:t>
-      </w:r>
-      <w:r>
-        <w:rPr>
-          <w:rFonts w:ascii="Consolas" w:hAnsi="Consolas"/>
-          <w:b w:val="0"/>
-          <w:sz w:val="19"/>
-        </w:rPr>
-        <w:t>AccountMenu</w:t>
-      </w:r>
-      <w:r>
-        <w:rPr>
-          <w:b w:val="0"/>
-        </w:rPr>
-        <w:t xml:space="preserve"> mostra ao usuário.</w:t>
-      </w:r>
-    </w:p>
-    <w:p>
-      <w:pPr>
-        <w:pStyle w:val="Heading2"/>
-      </w:pPr>
-      <w:r>
-        <w:t>6. Como rodar</w:t>
-      </w:r>
-    </w:p>
-    <w:p>
-      <w:r>
-        <w:rPr>
-          <w:b w:val="0"/>
-        </w:rPr>
-        <w:t xml:space="preserve">O script </w:t>
-      </w:r>
-      <w:r>
-        <w:rPr>
-          <w:rFonts w:ascii="Consolas" w:hAnsi="Consolas"/>
-          <w:b w:val="0"/>
-          <w:sz w:val="19"/>
-        </w:rPr>
-        <w:t>dev.sh</w:t>
-      </w:r>
-      <w:r>
-        <w:rPr>
-          <w:b w:val="0"/>
-        </w:rPr>
-        <w:t xml:space="preserve"> na raiz sobe o banco, o back-end e o front-end:</w:t>
-      </w:r>
-    </w:p>
-    <w:p>
-      <w:pPr>
-        <w:pStyle w:val="Codigo"/>
-      </w:pPr>
-      <w:r>
-        <w:t>./dev.sh          # inicia tudo; Ctrl+C encerra back-end e front-end</w:t>
-        <w:br/>
-        <w:t>./dev.sh --stop   # para o Postgres, que continua em segundo plano</w:t>
-      </w:r>
-    </w:p>
-    <w:p>
-      <w:pPr>
-        <w:pStyle w:val="ListBullet"/>
-        <w:spacing w:after="80"/>
-        <w:ind w:left="432"/>
-      </w:pPr>
-      <w:r>
-        <w:rPr>
-          <w:b w:val="0"/>
-        </w:rPr>
-        <w:t xml:space="preserve">Front-end: </w:t>
-      </w:r>
-      <w:r>
-        <w:rPr>
-          <w:b w:val="0"/>
-          <w:color w:val="1A4B8C"/>
-        </w:rPr>
-        <w:t>http://localhost:5173</w:t>
-      </w:r>
-    </w:p>
-    <w:p>
-      <w:pPr>
-        <w:pStyle w:val="ListBullet"/>
-        <w:spacing w:after="80"/>
-        <w:ind w:left="432"/>
-      </w:pPr>
-      <w:r>
-        <w:rPr>
-          <w:b w:val="0"/>
-        </w:rPr>
-        <w:t xml:space="preserve">API: </w:t>
-      </w:r>
-      <w:r>
-        <w:rPr>
-          <w:b w:val="0"/>
-          <w:color w:val="1A4B8C"/>
-        </w:rPr>
-        <w:t>http://localhost:8080</w:t>
-      </w:r>
-    </w:p>
-    <w:p>
-      <w:r>
-        <w:rPr>
-          <w:b w:val="0"/>
-        </w:rPr>
-        <w:t xml:space="preserve">Na primeira execução o </w:t>
-      </w:r>
-      <w:r>
-        <w:rPr>
-          <w:rFonts w:ascii="Consolas" w:hAnsi="Consolas"/>
-          <w:b w:val="0"/>
-          <w:sz w:val="19"/>
-        </w:rPr>
-        <w:t>DemoUsersSeeder</w:t>
-      </w:r>
-      <w:r>
-        <w:rPr>
-          <w:b w:val="0"/>
-        </w:rPr>
-        <w:t xml:space="preserve"> cria os usuários de teste, e o Flyway aplica as migrações. Exige Java 25 e Docker ou Podman instalados.</w:t>
+        <w:t>. Precisa de Java 25 e do Docker ou Podman instalados.</w:t>
       </w:r>
     </w:p>
     <w:sectPr>

</xml_diff>

<commit_message>
Atualiza a documentação e enxuga os comentários
</commit_message>
<xml_diff>
--- a/docs/arquitetura.docx
+++ b/docs/arquitetura.docx
@@ -7,7 +7,7 @@
         <w:pStyle w:val="Heading1"/>
       </w:pPr>
       <w:r>
-        <w:t>Xopxe — Camadas da Arquitetura</w:t>
+        <w:t>Xopxe: camadas da arquitetura</w:t>
       </w:r>
     </w:p>
     <w:p>
@@ -23,7 +23,15 @@
         <w:rPr>
           <w:b w:val="0"/>
         </w:rPr>
-        <w:t>O Xopxe é um site de acervo de livros. Ele é dividido em duas aplicações separadas:</w:t>
+        <w:t>O Xopxe é um site de acervo de livros. Qualquer pessoa pode ver o catálogo. Quem tem conta pode avaliar os livros, e o admin cadastra, edita e remove livros, além de moderar as avaliações. Os livros gratuitos abrem num leitor de PDF dentro do site.</w:t>
+      </w:r>
+    </w:p>
+    <w:p>
+      <w:r>
+        <w:rPr>
+          <w:b w:val="0"/>
+        </w:rPr>
+        <w:t>O sistema é dividido em duas aplicações separadas:</w:t>
       </w:r>
     </w:p>
     <w:tbl>
@@ -315,6 +323,14 @@
     </w:tbl>
     <w:p/>
     <w:p>
+      <w:r>
+        <w:rPr>
+          <w:b w:val="0"/>
+        </w:rPr>
+        <w:t>A versão online está em https://xopxe.vercel.app. O front fica na Vercel e o back e o banco ficam no Render.</w:t>
+      </w:r>
+    </w:p>
+    <w:p>
       <w:pPr>
         <w:pStyle w:val="Heading2"/>
       </w:pPr>
@@ -336,6 +352,20 @@
           <w:sz w:val="19"/>
         </w:rPr>
         <w:t>book</w:t>
+      </w:r>
+      <w:r>
+        <w:rPr>
+          <w:b w:val="0"/>
+        </w:rPr>
+        <w:t xml:space="preserve">, </w:t>
+      </w:r>
+      <w:r>
+        <w:rPr>
+          <w:rFonts w:ascii="Consolas" w:hAnsi="Consolas"/>
+          <w:b w:val="0"/>
+          <w:sz w:val="19"/>
+        </w:rPr>
+        <w:t>review</w:t>
       </w:r>
       <w:r>
         <w:rPr>
@@ -387,6 +417,8 @@
         <w:br/>
         <w:t>│   │   ├── Book.java             entidade JPA</w:t>
         <w:br/>
+        <w:t>│   │   ├── BookAccessType.java   enum FREE / PURCHASE</w:t>
+        <w:br/>
         <w:t>│   │   ├── BookRepository.java   repositório</w:t>
         <w:br/>
         <w:t>│   │   ├── BookService.java      regras de negócio</w:t>
@@ -394,6 +426,18 @@
         <w:t>│   │   ├── BookController.java   rotas HTTP</w:t>
         <w:br/>
         <w:t>│   │   └── BookDtos.java         dados que entram e saem da API</w:t>
+        <w:br/>
+        <w:t>│   ├── review/</w:t>
+        <w:br/>
+        <w:t>│   │   ├── Review.java           entidade JPA</w:t>
+        <w:br/>
+        <w:t>│   │   ├── ReviewRepository.java</w:t>
+        <w:br/>
+        <w:t>│   │   ├── ReviewService.java</w:t>
+        <w:br/>
+        <w:t>│   │   ├── ReviewController.java</w:t>
+        <w:br/>
+        <w:t>│   │   └── ReviewDtos.java</w:t>
         <w:br/>
         <w:t>│   ├── user/</w:t>
         <w:br/>
@@ -407,9 +451,15 @@
         <w:br/>
         <w:t>│   ├── auth/</w:t>
         <w:br/>
-        <w:t>│   │   ├── AuthController.java   login e cadastro</w:t>
+        <w:t>│   │   ├── AuthController.java   login, cadastro e logout</w:t>
         <w:br/>
-        <w:t>│   │   └── AuthDtos.java</w:t>
+        <w:t>│   │   ├── AuthDtos.java</w:t>
+        <w:br/>
+        <w:t>│   │   ├── SessionLogin.java     abre e fecha a sessão</w:t>
+        <w:br/>
+        <w:t>│   │   ├── GoogleLoginSettings.java</w:t>
+        <w:br/>
+        <w:t>│   │   └── GoogleLoginSuccessHandler.java</w:t>
         <w:br/>
         <w:t>│   └── config/</w:t>
         <w:br/>
@@ -417,11 +467,17 @@
         <w:br/>
         <w:t>│       ├── ApiExceptionHandler.java</w:t>
         <w:br/>
+        <w:t>│       ├── OpenApiConfig.java    Swagger</w:t>
+        <w:br/>
+        <w:t>│       ├── BookSeeder.java       livros iniciais</w:t>
+        <w:br/>
         <w:t>│       └── DemoUsersSeeder.java  usuários de teste</w:t>
         <w:br/>
         <w:t>└── resources/</w:t>
         <w:br/>
         <w:t xml:space="preserve">    ├── application.yaml</w:t>
+        <w:br/>
+        <w:t xml:space="preserve">    ├── seed/books.json           catálogo inicial</w:t>
         <w:br/>
         <w:t xml:space="preserve">    └── db/migration/             scripts do Flyway que criam as tabelas</w:t>
       </w:r>
@@ -447,6 +503,20 @@
         <w:rPr>
           <w:b w:val="0"/>
         </w:rPr>
+        <w:t xml:space="preserve">, </w:t>
+      </w:r>
+      <w:r>
+        <w:rPr>
+          <w:rFonts w:ascii="Consolas" w:hAnsi="Consolas"/>
+          <w:b w:val="0"/>
+          <w:sz w:val="19"/>
+        </w:rPr>
+        <w:t>User</w:t>
+      </w:r>
+      <w:r>
+        <w:rPr>
+          <w:b w:val="0"/>
+        </w:rPr>
         <w:t xml:space="preserve"> e </w:t>
       </w:r>
       <w:r>
@@ -455,7 +525,7 @@
           <w:b w:val="0"/>
           <w:sz w:val="19"/>
         </w:rPr>
-        <w:t>User</w:t>
+        <w:t>Review</w:t>
       </w:r>
       <w:r>
         <w:rPr>
@@ -522,7 +592,7 @@
         <w:rPr>
           <w:b w:val="0"/>
         </w:rPr>
-        <w:t xml:space="preserve">. O Hibernate está configurado com </w:t>
+        <w:t xml:space="preserve"> (V1 a V5). O Hibernate está configurado com </w:t>
       </w:r>
       <w:r>
         <w:rPr>
@@ -580,6 +650,20 @@
         <w:rPr>
           <w:b w:val="0"/>
         </w:rPr>
+        <w:t xml:space="preserve">, </w:t>
+      </w:r>
+      <w:r>
+        <w:rPr>
+          <w:rFonts w:ascii="Consolas" w:hAnsi="Consolas"/>
+          <w:b w:val="0"/>
+          <w:sz w:val="19"/>
+        </w:rPr>
+        <w:t>BookDtos</w:t>
+      </w:r>
+      <w:r>
+        <w:rPr>
+          <w:b w:val="0"/>
+        </w:rPr>
         <w:t xml:space="preserve"> e </w:t>
       </w:r>
       <w:r>
@@ -588,7 +672,7 @@
           <w:b w:val="0"/>
           <w:sz w:val="19"/>
         </w:rPr>
-        <w:t>BookDtos</w:t>
+        <w:t>ReviewDtos</w:t>
       </w:r>
       <w:r>
         <w:rPr>
@@ -630,6 +714,34 @@
         <w:rPr>
           <w:b w:val="0"/>
         </w:rPr>
+        <w:t xml:space="preserve">, </w:t>
+      </w:r>
+      <w:r>
+        <w:rPr>
+          <w:rFonts w:ascii="Consolas" w:hAnsi="Consolas"/>
+          <w:b w:val="0"/>
+          <w:sz w:val="19"/>
+        </w:rPr>
+        <w:t>@Size</w:t>
+      </w:r>
+      <w:r>
+        <w:rPr>
+          <w:b w:val="0"/>
+        </w:rPr>
+        <w:t xml:space="preserve">, </w:t>
+      </w:r>
+      <w:r>
+        <w:rPr>
+          <w:rFonts w:ascii="Consolas" w:hAnsi="Consolas"/>
+          <w:b w:val="0"/>
+          <w:sz w:val="19"/>
+        </w:rPr>
+        <w:t>@Min</w:t>
+      </w:r>
+      <w:r>
+        <w:rPr>
+          <w:b w:val="0"/>
+        </w:rPr>
         <w:t xml:space="preserve"> e </w:t>
       </w:r>
       <w:r>
@@ -638,7 +750,7 @@
           <w:b w:val="0"/>
           <w:sz w:val="19"/>
         </w:rPr>
-        <w:t>@Size</w:t>
+        <w:t>@Max</w:t>
       </w:r>
       <w:r>
         <w:rPr>
@@ -752,6 +864,20 @@
         <w:rPr>
           <w:b w:val="0"/>
         </w:rPr>
+        <w:t xml:space="preserve">, </w:t>
+      </w:r>
+      <w:r>
+        <w:rPr>
+          <w:rFonts w:ascii="Consolas" w:hAnsi="Consolas"/>
+          <w:b w:val="0"/>
+          <w:sz w:val="19"/>
+        </w:rPr>
+        <w:t>findAll</w:t>
+      </w:r>
+      <w:r>
+        <w:rPr>
+          <w:b w:val="0"/>
+        </w:rPr>
         <w:t xml:space="preserve"> e </w:t>
       </w:r>
       <w:r>
@@ -760,7 +886,7 @@
           <w:b w:val="0"/>
           <w:sz w:val="19"/>
         </w:rPr>
-        <w:t>findAll</w:t>
+        <w:t>delete</w:t>
       </w:r>
       <w:r>
         <w:rPr>
@@ -782,7 +908,15 @@
         <w:rPr>
           <w:b w:val="0"/>
         </w:rPr>
-        <w:t xml:space="preserve">Ficam entre o controlador e o repositório e guardam as regras de negócio. O </w:t>
+        <w:t>Ficam entre o controlador e o repositório e guardam as regras de negócio.</w:t>
+      </w:r>
+    </w:p>
+    <w:p>
+      <w:r>
+        <w:rPr>
+          <w:b w:val="0"/>
+        </w:rPr>
+        <w:t xml:space="preserve">O </w:t>
       </w:r>
       <w:r>
         <w:rPr>
@@ -796,7 +930,7 @@
         <w:rPr>
           <w:b w:val="0"/>
         </w:rPr>
-        <w:t xml:space="preserve"> ainda não foi implementado: os métodos lançam </w:t>
+        <w:t xml:space="preserve"> lista os livros (com busca por título ou autor e filtro por gênero), busca um livro pelo id (404 se não existir), cadastra, edita e apaga. No cadastro e na edição ele confere o tipo de acesso: livro </w:t>
       </w:r>
       <w:r>
         <w:rPr>
@@ -804,13 +938,49 @@
           <w:b w:val="0"/>
           <w:sz w:val="19"/>
         </w:rPr>
-        <w:t>UnsupportedOperationException</w:t>
+        <w:t>FREE</w:t>
       </w:r>
       <w:r>
         <w:rPr>
           <w:b w:val="0"/>
         </w:rPr>
-        <w:t>, então as rotas de livro respondem erro 500. O catálogo da tela ainda usa dados mockados.</w:t>
+        <w:t xml:space="preserve"> precisa do link do PDF e livro </w:t>
+      </w:r>
+      <w:r>
+        <w:rPr>
+          <w:rFonts w:ascii="Consolas" w:hAnsi="Consolas"/>
+          <w:b w:val="0"/>
+          <w:sz w:val="19"/>
+        </w:rPr>
+        <w:t>PURCHASE</w:t>
+      </w:r>
+      <w:r>
+        <w:rPr>
+          <w:b w:val="0"/>
+        </w:rPr>
+        <w:t xml:space="preserve"> precisa do link de compra.</w:t>
+      </w:r>
+    </w:p>
+    <w:p>
+      <w:r>
+        <w:rPr>
+          <w:b w:val="0"/>
+        </w:rPr>
+        <w:t xml:space="preserve">O </w:t>
+      </w:r>
+      <w:r>
+        <w:rPr>
+          <w:rFonts w:ascii="Consolas" w:hAnsi="Consolas"/>
+          <w:b w:val="0"/>
+          <w:sz w:val="19"/>
+        </w:rPr>
+        <w:t>ReviewService</w:t>
+      </w:r>
+      <w:r>
+        <w:rPr>
+          <w:b w:val="0"/>
+        </w:rPr>
+        <w:t xml:space="preserve"> cuida das avaliações. Cada usuário tem no máximo uma avaliação por livro: se ele mandar de novo, a anterior é atualizada. O usuário pode apagar a própria avaliação, e o admin pode apagar a de qualquer pessoa.</w:t>
       </w:r>
     </w:p>
     <w:p>
@@ -1080,6 +1250,213 @@
                 <w:b w:val="0"/>
                 <w:sz w:val="19"/>
               </w:rPr>
+              <w:t>POST</w:t>
+            </w:r>
+          </w:p>
+        </w:tc>
+        <w:tc>
+          <w:tcPr>
+            <w:tcW w:type="dxa" w:w="2880"/>
+          </w:tcPr>
+          <w:p>
+            <w:pPr>
+              <w:spacing w:after="40"/>
+            </w:pPr>
+            <w:r>
+              <w:rPr>
+                <w:sz w:val="19"/>
+              </w:rPr>
+            </w:r>
+            <w:r>
+              <w:rPr>
+                <w:rFonts w:ascii="Consolas" w:hAnsi="Consolas"/>
+                <w:b w:val="0"/>
+                <w:sz w:val="19"/>
+              </w:rPr>
+              <w:t>/api/auth/logout</w:t>
+            </w:r>
+          </w:p>
+        </w:tc>
+        <w:tc>
+          <w:tcPr>
+            <w:tcW w:type="dxa" w:w="2880"/>
+          </w:tcPr>
+          <w:p>
+            <w:pPr>
+              <w:spacing w:after="40"/>
+            </w:pPr>
+            <w:r>
+              <w:rPr>
+                <w:sz w:val="19"/>
+              </w:rPr>
+            </w:r>
+            <w:r>
+              <w:rPr>
+                <w:b w:val="0"/>
+                <w:sz w:val="19"/>
+              </w:rPr>
+              <w:t>público</w:t>
+            </w:r>
+          </w:p>
+        </w:tc>
+      </w:tr>
+      <w:tr>
+        <w:tc>
+          <w:tcPr>
+            <w:tcW w:type="dxa" w:w="2880"/>
+          </w:tcPr>
+          <w:p>
+            <w:pPr>
+              <w:spacing w:after="40"/>
+            </w:pPr>
+            <w:r>
+              <w:rPr>
+                <w:sz w:val="19"/>
+              </w:rPr>
+            </w:r>
+            <w:r>
+              <w:rPr>
+                <w:b w:val="0"/>
+                <w:sz w:val="19"/>
+              </w:rPr>
+              <w:t>GET</w:t>
+            </w:r>
+          </w:p>
+        </w:tc>
+        <w:tc>
+          <w:tcPr>
+            <w:tcW w:type="dxa" w:w="2880"/>
+          </w:tcPr>
+          <w:p>
+            <w:pPr>
+              <w:spacing w:after="40"/>
+            </w:pPr>
+            <w:r>
+              <w:rPr>
+                <w:sz w:val="19"/>
+              </w:rPr>
+            </w:r>
+            <w:r>
+              <w:rPr>
+                <w:rFonts w:ascii="Consolas" w:hAnsi="Consolas"/>
+                <w:b w:val="0"/>
+                <w:sz w:val="19"/>
+              </w:rPr>
+              <w:t>/api/auth/providers</w:t>
+            </w:r>
+          </w:p>
+        </w:tc>
+        <w:tc>
+          <w:tcPr>
+            <w:tcW w:type="dxa" w:w="2880"/>
+          </w:tcPr>
+          <w:p>
+            <w:pPr>
+              <w:spacing w:after="40"/>
+            </w:pPr>
+            <w:r>
+              <w:rPr>
+                <w:sz w:val="19"/>
+              </w:rPr>
+            </w:r>
+            <w:r>
+              <w:rPr>
+                <w:b w:val="0"/>
+                <w:sz w:val="19"/>
+              </w:rPr>
+              <w:t>público</w:t>
+            </w:r>
+          </w:p>
+        </w:tc>
+      </w:tr>
+      <w:tr>
+        <w:tc>
+          <w:tcPr>
+            <w:tcW w:type="dxa" w:w="2880"/>
+          </w:tcPr>
+          <w:p>
+            <w:pPr>
+              <w:spacing w:after="40"/>
+            </w:pPr>
+            <w:r>
+              <w:rPr>
+                <w:sz w:val="19"/>
+              </w:rPr>
+            </w:r>
+            <w:r>
+              <w:rPr>
+                <w:b w:val="0"/>
+                <w:sz w:val="19"/>
+              </w:rPr>
+              <w:t>GET</w:t>
+            </w:r>
+          </w:p>
+        </w:tc>
+        <w:tc>
+          <w:tcPr>
+            <w:tcW w:type="dxa" w:w="2880"/>
+          </w:tcPr>
+          <w:p>
+            <w:pPr>
+              <w:spacing w:after="40"/>
+            </w:pPr>
+            <w:r>
+              <w:rPr>
+                <w:sz w:val="19"/>
+              </w:rPr>
+            </w:r>
+            <w:r>
+              <w:rPr>
+                <w:rFonts w:ascii="Consolas" w:hAnsi="Consolas"/>
+                <w:b w:val="0"/>
+                <w:sz w:val="19"/>
+              </w:rPr>
+              <w:t>/api/auth/me</w:t>
+            </w:r>
+          </w:p>
+        </w:tc>
+        <w:tc>
+          <w:tcPr>
+            <w:tcW w:type="dxa" w:w="2880"/>
+          </w:tcPr>
+          <w:p>
+            <w:pPr>
+              <w:spacing w:after="40"/>
+            </w:pPr>
+            <w:r>
+              <w:rPr>
+                <w:sz w:val="19"/>
+              </w:rPr>
+            </w:r>
+            <w:r>
+              <w:rPr>
+                <w:b w:val="0"/>
+                <w:sz w:val="19"/>
+              </w:rPr>
+              <w:t>logado</w:t>
+            </w:r>
+          </w:p>
+        </w:tc>
+      </w:tr>
+      <w:tr>
+        <w:tc>
+          <w:tcPr>
+            <w:tcW w:type="dxa" w:w="2880"/>
+          </w:tcPr>
+          <w:p>
+            <w:pPr>
+              <w:spacing w:after="40"/>
+            </w:pPr>
+            <w:r>
+              <w:rPr>
+                <w:sz w:val="19"/>
+              </w:rPr>
+            </w:r>
+            <w:r>
+              <w:rPr>
+                <w:b w:val="0"/>
+                <w:sz w:val="19"/>
+              </w:rPr>
               <w:t>GET</w:t>
             </w:r>
           </w:p>
@@ -1268,14 +1645,450 @@
           </w:p>
         </w:tc>
       </w:tr>
+      <w:tr>
+        <w:tc>
+          <w:tcPr>
+            <w:tcW w:type="dxa" w:w="2880"/>
+          </w:tcPr>
+          <w:p>
+            <w:pPr>
+              <w:spacing w:after="40"/>
+            </w:pPr>
+            <w:r>
+              <w:rPr>
+                <w:sz w:val="19"/>
+              </w:rPr>
+            </w:r>
+            <w:r>
+              <w:rPr>
+                <w:b w:val="0"/>
+                <w:sz w:val="19"/>
+              </w:rPr>
+              <w:t>PUT</w:t>
+            </w:r>
+          </w:p>
+        </w:tc>
+        <w:tc>
+          <w:tcPr>
+            <w:tcW w:type="dxa" w:w="2880"/>
+          </w:tcPr>
+          <w:p>
+            <w:pPr>
+              <w:spacing w:after="40"/>
+            </w:pPr>
+            <w:r>
+              <w:rPr>
+                <w:sz w:val="19"/>
+              </w:rPr>
+            </w:r>
+            <w:r>
+              <w:rPr>
+                <w:rFonts w:ascii="Consolas" w:hAnsi="Consolas"/>
+                <w:b w:val="0"/>
+                <w:sz w:val="19"/>
+              </w:rPr>
+              <w:t>/api/books/{id}</w:t>
+            </w:r>
+          </w:p>
+        </w:tc>
+        <w:tc>
+          <w:tcPr>
+            <w:tcW w:type="dxa" w:w="2880"/>
+          </w:tcPr>
+          <w:p>
+            <w:pPr>
+              <w:spacing w:after="40"/>
+            </w:pPr>
+            <w:r>
+              <w:rPr>
+                <w:sz w:val="19"/>
+              </w:rPr>
+            </w:r>
+            <w:r>
+              <w:rPr>
+                <w:b w:val="0"/>
+                <w:sz w:val="19"/>
+              </w:rPr>
+              <w:t>ADMIN</w:t>
+            </w:r>
+          </w:p>
+        </w:tc>
+      </w:tr>
+      <w:tr>
+        <w:tc>
+          <w:tcPr>
+            <w:tcW w:type="dxa" w:w="2880"/>
+          </w:tcPr>
+          <w:p>
+            <w:pPr>
+              <w:spacing w:after="40"/>
+            </w:pPr>
+            <w:r>
+              <w:rPr>
+                <w:sz w:val="19"/>
+              </w:rPr>
+            </w:r>
+            <w:r>
+              <w:rPr>
+                <w:b w:val="0"/>
+                <w:sz w:val="19"/>
+              </w:rPr>
+              <w:t>DELETE</w:t>
+            </w:r>
+          </w:p>
+        </w:tc>
+        <w:tc>
+          <w:tcPr>
+            <w:tcW w:type="dxa" w:w="2880"/>
+          </w:tcPr>
+          <w:p>
+            <w:pPr>
+              <w:spacing w:after="40"/>
+            </w:pPr>
+            <w:r>
+              <w:rPr>
+                <w:sz w:val="19"/>
+              </w:rPr>
+            </w:r>
+            <w:r>
+              <w:rPr>
+                <w:rFonts w:ascii="Consolas" w:hAnsi="Consolas"/>
+                <w:b w:val="0"/>
+                <w:sz w:val="19"/>
+              </w:rPr>
+              <w:t>/api/books/{id}</w:t>
+            </w:r>
+          </w:p>
+        </w:tc>
+        <w:tc>
+          <w:tcPr>
+            <w:tcW w:type="dxa" w:w="2880"/>
+          </w:tcPr>
+          <w:p>
+            <w:pPr>
+              <w:spacing w:after="40"/>
+            </w:pPr>
+            <w:r>
+              <w:rPr>
+                <w:sz w:val="19"/>
+              </w:rPr>
+            </w:r>
+            <w:r>
+              <w:rPr>
+                <w:b w:val="0"/>
+                <w:sz w:val="19"/>
+              </w:rPr>
+              <w:t>ADMIN</w:t>
+            </w:r>
+          </w:p>
+        </w:tc>
+      </w:tr>
+      <w:tr>
+        <w:tc>
+          <w:tcPr>
+            <w:tcW w:type="dxa" w:w="2880"/>
+          </w:tcPr>
+          <w:p>
+            <w:pPr>
+              <w:spacing w:after="40"/>
+            </w:pPr>
+            <w:r>
+              <w:rPr>
+                <w:sz w:val="19"/>
+              </w:rPr>
+            </w:r>
+            <w:r>
+              <w:rPr>
+                <w:b w:val="0"/>
+                <w:sz w:val="19"/>
+              </w:rPr>
+              <w:t>GET</w:t>
+            </w:r>
+          </w:p>
+        </w:tc>
+        <w:tc>
+          <w:tcPr>
+            <w:tcW w:type="dxa" w:w="2880"/>
+          </w:tcPr>
+          <w:p>
+            <w:pPr>
+              <w:spacing w:after="40"/>
+            </w:pPr>
+            <w:r>
+              <w:rPr>
+                <w:sz w:val="19"/>
+              </w:rPr>
+            </w:r>
+            <w:r>
+              <w:rPr>
+                <w:rFonts w:ascii="Consolas" w:hAnsi="Consolas"/>
+                <w:b w:val="0"/>
+                <w:sz w:val="19"/>
+              </w:rPr>
+              <w:t>/api/books/{id}/reviews</w:t>
+            </w:r>
+          </w:p>
+        </w:tc>
+        <w:tc>
+          <w:tcPr>
+            <w:tcW w:type="dxa" w:w="2880"/>
+          </w:tcPr>
+          <w:p>
+            <w:pPr>
+              <w:spacing w:after="40"/>
+            </w:pPr>
+            <w:r>
+              <w:rPr>
+                <w:sz w:val="19"/>
+              </w:rPr>
+            </w:r>
+            <w:r>
+              <w:rPr>
+                <w:b w:val="0"/>
+                <w:sz w:val="19"/>
+              </w:rPr>
+              <w:t>público</w:t>
+            </w:r>
+          </w:p>
+        </w:tc>
+      </w:tr>
+      <w:tr>
+        <w:tc>
+          <w:tcPr>
+            <w:tcW w:type="dxa" w:w="2880"/>
+          </w:tcPr>
+          <w:p>
+            <w:pPr>
+              <w:spacing w:after="40"/>
+            </w:pPr>
+            <w:r>
+              <w:rPr>
+                <w:sz w:val="19"/>
+              </w:rPr>
+            </w:r>
+            <w:r>
+              <w:rPr>
+                <w:b w:val="0"/>
+                <w:sz w:val="19"/>
+              </w:rPr>
+              <w:t>PUT</w:t>
+            </w:r>
+          </w:p>
+        </w:tc>
+        <w:tc>
+          <w:tcPr>
+            <w:tcW w:type="dxa" w:w="2880"/>
+          </w:tcPr>
+          <w:p>
+            <w:pPr>
+              <w:spacing w:after="40"/>
+            </w:pPr>
+            <w:r>
+              <w:rPr>
+                <w:sz w:val="19"/>
+              </w:rPr>
+            </w:r>
+            <w:r>
+              <w:rPr>
+                <w:rFonts w:ascii="Consolas" w:hAnsi="Consolas"/>
+                <w:b w:val="0"/>
+                <w:sz w:val="19"/>
+              </w:rPr>
+              <w:t>/api/books/{id}/reviews/mine</w:t>
+            </w:r>
+          </w:p>
+        </w:tc>
+        <w:tc>
+          <w:tcPr>
+            <w:tcW w:type="dxa" w:w="2880"/>
+          </w:tcPr>
+          <w:p>
+            <w:pPr>
+              <w:spacing w:after="40"/>
+            </w:pPr>
+            <w:r>
+              <w:rPr>
+                <w:sz w:val="19"/>
+              </w:rPr>
+            </w:r>
+            <w:r>
+              <w:rPr>
+                <w:b w:val="0"/>
+                <w:sz w:val="19"/>
+              </w:rPr>
+              <w:t>logado</w:t>
+            </w:r>
+          </w:p>
+        </w:tc>
+      </w:tr>
+      <w:tr>
+        <w:tc>
+          <w:tcPr>
+            <w:tcW w:type="dxa" w:w="2880"/>
+          </w:tcPr>
+          <w:p>
+            <w:pPr>
+              <w:spacing w:after="40"/>
+            </w:pPr>
+            <w:r>
+              <w:rPr>
+                <w:sz w:val="19"/>
+              </w:rPr>
+            </w:r>
+            <w:r>
+              <w:rPr>
+                <w:b w:val="0"/>
+                <w:sz w:val="19"/>
+              </w:rPr>
+              <w:t>DELETE</w:t>
+            </w:r>
+          </w:p>
+        </w:tc>
+        <w:tc>
+          <w:tcPr>
+            <w:tcW w:type="dxa" w:w="2880"/>
+          </w:tcPr>
+          <w:p>
+            <w:pPr>
+              <w:spacing w:after="40"/>
+            </w:pPr>
+            <w:r>
+              <w:rPr>
+                <w:sz w:val="19"/>
+              </w:rPr>
+            </w:r>
+            <w:r>
+              <w:rPr>
+                <w:rFonts w:ascii="Consolas" w:hAnsi="Consolas"/>
+                <w:b w:val="0"/>
+                <w:sz w:val="19"/>
+              </w:rPr>
+              <w:t>/api/books/{id}/reviews/mine</w:t>
+            </w:r>
+          </w:p>
+        </w:tc>
+        <w:tc>
+          <w:tcPr>
+            <w:tcW w:type="dxa" w:w="2880"/>
+          </w:tcPr>
+          <w:p>
+            <w:pPr>
+              <w:spacing w:after="40"/>
+            </w:pPr>
+            <w:r>
+              <w:rPr>
+                <w:sz w:val="19"/>
+              </w:rPr>
+            </w:r>
+            <w:r>
+              <w:rPr>
+                <w:b w:val="0"/>
+                <w:sz w:val="19"/>
+              </w:rPr>
+              <w:t>logado</w:t>
+            </w:r>
+          </w:p>
+        </w:tc>
+      </w:tr>
+      <w:tr>
+        <w:tc>
+          <w:tcPr>
+            <w:tcW w:type="dxa" w:w="2880"/>
+          </w:tcPr>
+          <w:p>
+            <w:pPr>
+              <w:spacing w:after="40"/>
+            </w:pPr>
+            <w:r>
+              <w:rPr>
+                <w:sz w:val="19"/>
+              </w:rPr>
+            </w:r>
+            <w:r>
+              <w:rPr>
+                <w:b w:val="0"/>
+                <w:sz w:val="19"/>
+              </w:rPr>
+              <w:t>DELETE</w:t>
+            </w:r>
+          </w:p>
+        </w:tc>
+        <w:tc>
+          <w:tcPr>
+            <w:tcW w:type="dxa" w:w="2880"/>
+          </w:tcPr>
+          <w:p>
+            <w:pPr>
+              <w:spacing w:after="40"/>
+            </w:pPr>
+            <w:r>
+              <w:rPr>
+                <w:sz w:val="19"/>
+              </w:rPr>
+            </w:r>
+            <w:r>
+              <w:rPr>
+                <w:rFonts w:ascii="Consolas" w:hAnsi="Consolas"/>
+                <w:b w:val="0"/>
+                <w:sz w:val="19"/>
+              </w:rPr>
+              <w:t>/api/reviews/{id}</w:t>
+            </w:r>
+          </w:p>
+        </w:tc>
+        <w:tc>
+          <w:tcPr>
+            <w:tcW w:type="dxa" w:w="2880"/>
+          </w:tcPr>
+          <w:p>
+            <w:pPr>
+              <w:spacing w:after="40"/>
+            </w:pPr>
+            <w:r>
+              <w:rPr>
+                <w:sz w:val="19"/>
+              </w:rPr>
+            </w:r>
+            <w:r>
+              <w:rPr>
+                <w:b w:val="0"/>
+                <w:sz w:val="19"/>
+              </w:rPr>
+              <w:t>ADMIN</w:t>
+            </w:r>
+          </w:p>
+        </w:tc>
+      </w:tr>
     </w:tbl>
     <w:p/>
+    <w:p>
+      <w:r>
+        <w:rPr>
+          <w:b w:val="0"/>
+        </w:rPr>
+        <w:t xml:space="preserve">A documentação das rotas também fica no Swagger, em </w:t>
+      </w:r>
+      <w:r>
+        <w:rPr>
+          <w:rFonts w:ascii="Consolas" w:hAnsi="Consolas"/>
+          <w:b w:val="0"/>
+          <w:sz w:val="19"/>
+        </w:rPr>
+        <w:t>/swagger-ui.html</w:t>
+      </w:r>
+      <w:r>
+        <w:rPr>
+          <w:b w:val="0"/>
+        </w:rPr>
+        <w:t>.</w:t>
+      </w:r>
+    </w:p>
     <w:p>
       <w:pPr>
         <w:pStyle w:val="Heading3"/>
       </w:pPr>
       <w:r>
-        <w:t>Configuração</w:t>
+        <w:t>Segurança</w:t>
       </w:r>
     </w:p>
     <w:p>
@@ -1291,7 +2104,7 @@
         <w:rPr>
           <w:b w:val="0"/>
         </w:rPr>
-        <w:t xml:space="preserve"> define quem acessa o quê, libera o endereço do front no CORS e registra o </w:t>
+        <w:t xml:space="preserve"> define quem acessa o quê (tabela acima), libera o endereço do front no CORS e registra o </w:t>
       </w:r>
       <w:r>
         <w:rPr>
@@ -1305,7 +2118,43 @@
         <w:rPr>
           <w:b w:val="0"/>
         </w:rPr>
-        <w:t>, usado para gravar a senha com hash.</w:t>
+        <w:t xml:space="preserve">, usado para gravar a senha com hash. O usuário logado fica guardado na sessão (cookie </w:t>
+      </w:r>
+      <w:r>
+        <w:rPr>
+          <w:rFonts w:ascii="Consolas" w:hAnsi="Consolas"/>
+          <w:b w:val="0"/>
+          <w:sz w:val="19"/>
+        </w:rPr>
+        <w:t>JSESSIONID</w:t>
+      </w:r>
+      <w:r>
+        <w:rPr>
+          <w:b w:val="0"/>
+        </w:rPr>
+        <w:t>).</w:t>
+      </w:r>
+    </w:p>
+    <w:p>
+      <w:r>
+        <w:rPr>
+          <w:b w:val="0"/>
+        </w:rPr>
+        <w:t xml:space="preserve">Dá para entrar com e-mail e senha ou com a conta do Google. O </w:t>
+      </w:r>
+      <w:r>
+        <w:rPr>
+          <w:rFonts w:ascii="Consolas" w:hAnsi="Consolas"/>
+          <w:b w:val="0"/>
+          <w:sz w:val="19"/>
+        </w:rPr>
+        <w:t>GoogleLoginSuccessHandler</w:t>
+      </w:r>
+      <w:r>
+        <w:rPr>
+          <w:b w:val="0"/>
+        </w:rPr>
+        <w:t xml:space="preserve"> procura o usuário pelo e-mail (ou cria um novo, com papel USER) e abre a sessão do mesmo jeito que o login com senha.</w:t>
       </w:r>
     </w:p>
     <w:p>
@@ -1340,6 +2189,78 @@
     </w:p>
     <w:p>
       <w:pPr>
+        <w:pStyle w:val="Heading3"/>
+      </w:pPr>
+      <w:r>
+        <w:t>Dados iniciais</w:t>
+      </w:r>
+    </w:p>
+    <w:p>
+      <w:r>
+        <w:rPr>
+          <w:b w:val="0"/>
+        </w:rPr>
+        <w:t xml:space="preserve">Quando o banco está vazio, o </w:t>
+      </w:r>
+      <w:r>
+        <w:rPr>
+          <w:rFonts w:ascii="Consolas" w:hAnsi="Consolas"/>
+          <w:b w:val="0"/>
+          <w:sz w:val="19"/>
+        </w:rPr>
+        <w:t>DemoUsersSeeder</w:t>
+      </w:r>
+      <w:r>
+        <w:rPr>
+          <w:b w:val="0"/>
+        </w:rPr>
+        <w:t xml:space="preserve"> cria os usuários de teste e o </w:t>
+      </w:r>
+      <w:r>
+        <w:rPr>
+          <w:rFonts w:ascii="Consolas" w:hAnsi="Consolas"/>
+          <w:b w:val="0"/>
+          <w:sz w:val="19"/>
+        </w:rPr>
+        <w:t>BookSeeder</w:t>
+      </w:r>
+      <w:r>
+        <w:rPr>
+          <w:b w:val="0"/>
+        </w:rPr>
+        <w:t xml:space="preserve"> cadastra os livros de </w:t>
+      </w:r>
+      <w:r>
+        <w:rPr>
+          <w:rFonts w:ascii="Consolas" w:hAnsi="Consolas"/>
+          <w:b w:val="0"/>
+          <w:sz w:val="19"/>
+        </w:rPr>
+        <w:t>seed/books.json</w:t>
+      </w:r>
+      <w:r>
+        <w:rPr>
+          <w:b w:val="0"/>
+        </w:rPr>
+        <w:t xml:space="preserve">. Esse arquivo é gerado pelo </w:t>
+      </w:r>
+      <w:r>
+        <w:rPr>
+          <w:rFonts w:ascii="Consolas" w:hAnsi="Consolas"/>
+          <w:b w:val="0"/>
+          <w:sz w:val="19"/>
+        </w:rPr>
+        <w:t>frontend/importador.js</w:t>
+      </w:r>
+      <w:r>
+        <w:rPr>
+          <w:b w:val="0"/>
+        </w:rPr>
+        <w:t>, que busca livros no Internet Archive e no Google Books.</w:t>
+      </w:r>
+    </w:p>
+    <w:p>
+      <w:pPr>
         <w:pStyle w:val="Heading2"/>
       </w:pPr>
       <w:r>
@@ -1355,17 +2276,19 @@
         <w:br/>
         <w:t>├── main.jsx        inicia o React e carrega o CSS global</w:t>
         <w:br/>
-        <w:t>├── App.jsx         troca de página</w:t>
+        <w:t>├── App.jsx         troca de página e guarda o usuário logado</w:t>
         <w:br/>
         <w:t>├── pages/          telas inteiras: MainPage e BookRegistration</w:t>
         <w:br/>
         <w:t>├── components/     peças da tela (Header, SearchBar, Filters, BooksCatalog,</w:t>
         <w:br/>
-        <w:t>│                   BooksInfo, DefaultInfo, BookForm, AccountMenu)</w:t>
+        <w:t>│                   BooksInfo, DefaultInfo, BookForm, AccountMenu,</w:t>
         <w:br/>
-        <w:t>├── api/            chamadas ao back-end (auth.js)</w:t>
+        <w:t>│                   ReviewForm, ReviewList, PdfReader, Toast)</w:t>
         <w:br/>
-        <w:t>├── data/           dados de exemplo</w:t>
+        <w:t>├── api/            chamadas ao back-end (auth, books, reviews)</w:t>
+        <w:br/>
+        <w:t>├── data/           listas fixas (gêneros, faixas de ano) e as estrelas</w:t>
         <w:br/>
         <w:t>├── styles/         todo o CSS</w:t>
         <w:br/>
@@ -1497,7 +2420,43 @@
         <w:rPr>
           <w:b w:val="0"/>
         </w:rPr>
-        <w:t xml:space="preserve"> guarda a busca, os filtros e o livro selecionado.</w:t>
+        <w:t xml:space="preserve"> guarda a lista de livros, a busca, os filtros e o livro selecionado.</w:t>
+      </w:r>
+    </w:p>
+    <w:p>
+      <w:r>
+        <w:rPr>
+          <w:b w:val="0"/>
+        </w:rPr>
+        <w:t xml:space="preserve">Todas as chamadas passam pelo </w:t>
+      </w:r>
+      <w:r>
+        <w:rPr>
+          <w:rFonts w:ascii="Consolas" w:hAnsi="Consolas"/>
+          <w:b w:val="0"/>
+          <w:sz w:val="19"/>
+        </w:rPr>
+        <w:t>api/client.js</w:t>
+      </w:r>
+      <w:r>
+        <w:rPr>
+          <w:b w:val="0"/>
+        </w:rPr>
+        <w:t xml:space="preserve">. Os caminhos começam com </w:t>
+      </w:r>
+      <w:r>
+        <w:rPr>
+          <w:rFonts w:ascii="Consolas" w:hAnsi="Consolas"/>
+          <w:b w:val="0"/>
+          <w:sz w:val="19"/>
+        </w:rPr>
+        <w:t>/api</w:t>
+      </w:r>
+      <w:r>
+        <w:rPr>
+          <w:b w:val="0"/>
+        </w:rPr>
+        <w:t xml:space="preserve"> e quem repassa para o back-end é o Vite (em desenvolvimento), o nginx (no Docker) ou a Vercel (online). Assim o site e a API ficam no mesmo endereço e o navegador manda o cookie da sessão sem configuração extra.</w:t>
       </w:r>
     </w:p>
     <w:p>
@@ -1513,7 +2472,7 @@
         <w:rPr>
           <w:b w:val="0"/>
         </w:rPr>
-        <w:t>As duas entidades do banco e o enum do papel do usuário.</w:t>
+        <w:t>As três entidades do banco e os dois enums.</w:t>
       </w:r>
     </w:p>
     <w:p>
@@ -1523,7 +2482,7 @@
       <w:r>
         <w:drawing>
           <wp:inline xmlns:a="http://schemas.openxmlformats.org/drawingml/2006/main" xmlns:pic="http://schemas.openxmlformats.org/drawingml/2006/picture">
-            <wp:extent cx="5943600" cy="8006549"/>
+            <wp:extent cx="5943600" cy="12972916"/>
             <wp:docPr id="1" name="Picture 1"/>
             <wp:cNvGraphicFramePr>
               <a:graphicFrameLocks noChangeAspect="1"/>
@@ -1544,7 +2503,7 @@
                   <pic:spPr>
                     <a:xfrm>
                       <a:off x="0" y="0"/>
-                      <a:ext cx="5943600" cy="8006549"/>
+                      <a:ext cx="5943600" cy="12972916"/>
                     </a:xfrm>
                     <a:prstGeom prst="rect"/>
                   </pic:spPr>
@@ -1594,7 +2553,7 @@
         <w:rPr>
           <w:b w:val="0"/>
         </w:rPr>
-        <w:t xml:space="preserve">, com o e-mail único e a senha gravada em hash. </w:t>
+        <w:t xml:space="preserve">, com o e-mail único e a senha gravada em hash (fica vazia em quem entrou pelo Google). </w:t>
       </w:r>
       <w:r>
         <w:rPr>
@@ -1622,7 +2581,121 @@
         <w:rPr>
           <w:b w:val="0"/>
         </w:rPr>
-        <w:t>, onde só a capa é opcional. As duas ainda não se relacionam, porque a tabela de avaliações não existe.</w:t>
+        <w:t xml:space="preserve">. O </w:t>
+      </w:r>
+      <w:r>
+        <w:rPr>
+          <w:rFonts w:ascii="Consolas" w:hAnsi="Consolas"/>
+          <w:b w:val="0"/>
+          <w:sz w:val="19"/>
+        </w:rPr>
+        <w:t>accessType</w:t>
+      </w:r>
+      <w:r>
+        <w:rPr>
+          <w:b w:val="0"/>
+        </w:rPr>
+        <w:t xml:space="preserve"> diz se o livro é gratuito (</w:t>
+      </w:r>
+      <w:r>
+        <w:rPr>
+          <w:rFonts w:ascii="Consolas" w:hAnsi="Consolas"/>
+          <w:b w:val="0"/>
+          <w:sz w:val="19"/>
+        </w:rPr>
+        <w:t>FREE</w:t>
+      </w:r>
+      <w:r>
+        <w:rPr>
+          <w:b w:val="0"/>
+        </w:rPr>
+        <w:t xml:space="preserve">, com </w:t>
+      </w:r>
+      <w:r>
+        <w:rPr>
+          <w:rFonts w:ascii="Consolas" w:hAnsi="Consolas"/>
+          <w:b w:val="0"/>
+          <w:sz w:val="19"/>
+        </w:rPr>
+        <w:t>pdfUrl</w:t>
+      </w:r>
+      <w:r>
+        <w:rPr>
+          <w:b w:val="0"/>
+        </w:rPr>
+        <w:t>) ou à venda (</w:t>
+      </w:r>
+      <w:r>
+        <w:rPr>
+          <w:rFonts w:ascii="Consolas" w:hAnsi="Consolas"/>
+          <w:b w:val="0"/>
+          <w:sz w:val="19"/>
+        </w:rPr>
+        <w:t>PURCHASE</w:t>
+      </w:r>
+      <w:r>
+        <w:rPr>
+          <w:b w:val="0"/>
+        </w:rPr>
+        <w:t xml:space="preserve">, com </w:t>
+      </w:r>
+      <w:r>
+        <w:rPr>
+          <w:rFonts w:ascii="Consolas" w:hAnsi="Consolas"/>
+          <w:b w:val="0"/>
+          <w:sz w:val="19"/>
+        </w:rPr>
+        <w:t>purchaseUrl</w:t>
+      </w:r>
+      <w:r>
+        <w:rPr>
+          <w:b w:val="0"/>
+        </w:rPr>
+        <w:t>).</w:t>
+      </w:r>
+    </w:p>
+    <w:p>
+      <w:r>
+        <w:rPr>
+          <w:rFonts w:ascii="Consolas" w:hAnsi="Consolas"/>
+          <w:b w:val="0"/>
+          <w:sz w:val="19"/>
+        </w:rPr>
+        <w:t>Review</w:t>
+      </w:r>
+      <w:r>
+        <w:rPr>
+          <w:b w:val="0"/>
+        </w:rPr>
+        <w:t xml:space="preserve"> vira a tabela </w:t>
+      </w:r>
+      <w:r>
+        <w:rPr>
+          <w:rFonts w:ascii="Consolas" w:hAnsi="Consolas"/>
+          <w:b w:val="0"/>
+          <w:sz w:val="19"/>
+        </w:rPr>
+        <w:t>reviews</w:t>
+      </w:r>
+      <w:r>
+        <w:rPr>
+          <w:b w:val="0"/>
+        </w:rPr>
+        <w:t xml:space="preserve"> e liga um usuário a um livro, com a nota de 1 a 5 e um comentário opcional. A tabela tem uma restrição </w:t>
+      </w:r>
+      <w:r>
+        <w:rPr>
+          <w:rFonts w:ascii="Consolas" w:hAnsi="Consolas"/>
+          <w:b w:val="0"/>
+          <w:sz w:val="19"/>
+        </w:rPr>
+        <w:t>UNIQUE (book_id, user_id)</w:t>
+      </w:r>
+      <w:r>
+        <w:rPr>
+          <w:b w:val="0"/>
+        </w:rPr>
+        <w:t>, que impede duas avaliações da mesma pessoa no mesmo livro.</w:t>
       </w:r>
     </w:p>
     <w:p>
@@ -1638,7 +2711,9 @@
         <w:pStyle w:val="Codigo"/>
       </w:pPr>
       <w:r>
-        <w:t>./dev.sh          # sobe banco, back-end e front-end</w:t>
+        <w:t>./run.sh          # sobe tudo com Docker em http://localhost:8000</w:t>
+        <w:br/>
+        <w:t>./dev.sh          # para programar: banco, back-end e front-end com recarga</w:t>
         <w:br/>
         <w:t>./dev.sh --stop   # para o banco</w:t>
       </w:r>
@@ -1648,7 +2723,21 @@
         <w:rPr>
           <w:b w:val="0"/>
         </w:rPr>
-        <w:t xml:space="preserve">O site abre em </w:t>
+        <w:t xml:space="preserve">Com o </w:t>
+      </w:r>
+      <w:r>
+        <w:rPr>
+          <w:rFonts w:ascii="Consolas" w:hAnsi="Consolas"/>
+          <w:b w:val="0"/>
+          <w:sz w:val="19"/>
+        </w:rPr>
+        <w:t>./dev.sh</w:t>
+      </w:r>
+      <w:r>
+        <w:rPr>
+          <w:b w:val="0"/>
+        </w:rPr>
+        <w:t xml:space="preserve"> o site abre em </w:t>
       </w:r>
       <w:r>
         <w:rPr>
@@ -1676,9 +2765,198 @@
         <w:rPr>
           <w:b w:val="0"/>
         </w:rPr>
-        <w:t>. Precisa de Java 25 e do Docker ou Podman instalados.</w:t>
+        <w:t xml:space="preserve">. O passo a passo completo está no </w:t>
+      </w:r>
+      <w:r>
+        <w:rPr>
+          <w:rFonts w:ascii="Consolas" w:hAnsi="Consolas"/>
+          <w:b w:val="0"/>
+          <w:sz w:val="19"/>
+        </w:rPr>
+        <w:t>INSTALACAO.md</w:t>
+      </w:r>
+      <w:r>
+        <w:rPr>
+          <w:b w:val="0"/>
+        </w:rPr>
+        <w:t>.</w:t>
       </w:r>
     </w:p>
+    <w:p>
+      <w:r>
+        <w:rPr>
+          <w:b w:val="0"/>
+        </w:rPr>
+        <w:t xml:space="preserve">Usuários de teste (senha </w:t>
+      </w:r>
+      <w:r>
+        <w:rPr>
+          <w:rFonts w:ascii="Consolas" w:hAnsi="Consolas"/>
+          <w:b w:val="0"/>
+          <w:sz w:val="19"/>
+        </w:rPr>
+        <w:t>password</w:t>
+      </w:r>
+      <w:r>
+        <w:rPr>
+          <w:b w:val="0"/>
+        </w:rPr>
+        <w:t xml:space="preserve"> quando roda no computador):</w:t>
+      </w:r>
+    </w:p>
+    <w:tbl>
+      <w:tblPr>
+        <w:tblStyle w:val="LightGrid-Accent1"/>
+        <w:tblW w:type="auto" w:w="0"/>
+        <w:jc w:val="center"/>
+        <w:tblLook w:firstColumn="1" w:firstRow="1" w:lastColumn="0" w:lastRow="0" w:noHBand="0" w:noVBand="1" w:val="04A0"/>
+      </w:tblPr>
+      <w:tblGrid>
+        <w:gridCol w:w="4320"/>
+        <w:gridCol w:w="4320"/>
+      </w:tblGrid>
+      <w:tr>
+        <w:tc>
+          <w:tcPr>
+            <w:tcW w:type="dxa" w:w="4320"/>
+          </w:tcPr>
+          <w:p>
+            <w:pPr>
+              <w:spacing w:after="40"/>
+            </w:pPr>
+            <w:r>
+              <w:rPr>
+                <w:sz w:val="19"/>
+              </w:rPr>
+            </w:r>
+            <w:r>
+              <w:rPr>
+                <w:b/>
+                <w:sz w:val="19"/>
+              </w:rPr>
+              <w:t>E-mail</w:t>
+            </w:r>
+          </w:p>
+        </w:tc>
+        <w:tc>
+          <w:tcPr>
+            <w:tcW w:type="dxa" w:w="4320"/>
+          </w:tcPr>
+          <w:p>
+            <w:pPr>
+              <w:spacing w:after="40"/>
+            </w:pPr>
+            <w:r>
+              <w:rPr>
+                <w:sz w:val="19"/>
+              </w:rPr>
+            </w:r>
+            <w:r>
+              <w:rPr>
+                <w:b/>
+                <w:sz w:val="19"/>
+              </w:rPr>
+              <w:t>Papel</w:t>
+            </w:r>
+          </w:p>
+        </w:tc>
+      </w:tr>
+      <w:tr>
+        <w:tc>
+          <w:tcPr>
+            <w:tcW w:type="dxa" w:w="4320"/>
+          </w:tcPr>
+          <w:p>
+            <w:pPr>
+              <w:spacing w:after="40"/>
+            </w:pPr>
+            <w:r>
+              <w:rPr>
+                <w:sz w:val="19"/>
+              </w:rPr>
+            </w:r>
+            <w:r>
+              <w:rPr>
+                <w:rFonts w:ascii="Consolas" w:hAnsi="Consolas"/>
+                <w:b w:val="0"/>
+                <w:sz w:val="19"/>
+              </w:rPr>
+              <w:t>admin@xopxe.com</w:t>
+            </w:r>
+          </w:p>
+        </w:tc>
+        <w:tc>
+          <w:tcPr>
+            <w:tcW w:type="dxa" w:w="4320"/>
+          </w:tcPr>
+          <w:p>
+            <w:pPr>
+              <w:spacing w:after="40"/>
+            </w:pPr>
+            <w:r>
+              <w:rPr>
+                <w:sz w:val="19"/>
+              </w:rPr>
+            </w:r>
+            <w:r>
+              <w:rPr>
+                <w:b w:val="0"/>
+                <w:sz w:val="19"/>
+              </w:rPr>
+              <w:t>ADMIN</w:t>
+            </w:r>
+          </w:p>
+        </w:tc>
+      </w:tr>
+      <w:tr>
+        <w:tc>
+          <w:tcPr>
+            <w:tcW w:type="dxa" w:w="4320"/>
+          </w:tcPr>
+          <w:p>
+            <w:pPr>
+              <w:spacing w:after="40"/>
+            </w:pPr>
+            <w:r>
+              <w:rPr>
+                <w:sz w:val="19"/>
+              </w:rPr>
+            </w:r>
+            <w:r>
+              <w:rPr>
+                <w:rFonts w:ascii="Consolas" w:hAnsi="Consolas"/>
+                <w:b w:val="0"/>
+                <w:sz w:val="19"/>
+              </w:rPr>
+              <w:t>user@xopxe.com</w:t>
+            </w:r>
+          </w:p>
+        </w:tc>
+        <w:tc>
+          <w:tcPr>
+            <w:tcW w:type="dxa" w:w="4320"/>
+          </w:tcPr>
+          <w:p>
+            <w:pPr>
+              <w:spacing w:after="40"/>
+            </w:pPr>
+            <w:r>
+              <w:rPr>
+                <w:sz w:val="19"/>
+              </w:rPr>
+            </w:r>
+            <w:r>
+              <w:rPr>
+                <w:b w:val="0"/>
+                <w:sz w:val="19"/>
+              </w:rPr>
+              <w:t>USER</w:t>
+            </w:r>
+          </w:p>
+        </w:tc>
+      </w:tr>
+    </w:tbl>
+    <w:p/>
     <w:sectPr>
       <w:pgSz w:w="12240" w:h="15840"/>
       <w:pgMar w:top="1440" w:right="1800" w:bottom="1440" w:left="1800" w:header="720" w:footer="720" w:gutter="0"/>

</xml_diff>

<commit_message>
Troca o link da capa por envio de arquivo
</commit_message>
<xml_diff>
--- a/docs/arquitetura.docx
+++ b/docs/arquitetura.docx
@@ -425,7 +425,13 @@
         <w:br/>
         <w:t>│   │   ├── BookController.java   rotas HTTP</w:t>
         <w:br/>
-        <w:t>│   │   └── BookDtos.java         dados que entram e saem da API</w:t>
+        <w:t>│   │   ├── BookDtos.java         dados que entram e saem da API</w:t>
+        <w:br/>
+        <w:t>│   │   ├── Cover.java            entidade JPA da imagem de capa</w:t>
+        <w:br/>
+        <w:t>│   │   ├── CoverRepository.java</w:t>
+        <w:br/>
+        <w:t>│   │   └── CoverController.java  envio e leitura das capas</w:t>
         <w:br/>
         <w:t>│   ├── review/</w:t>
         <w:br/>
@@ -517,6 +523,20 @@
         <w:rPr>
           <w:b w:val="0"/>
         </w:rPr>
+        <w:t xml:space="preserve">, </w:t>
+      </w:r>
+      <w:r>
+        <w:rPr>
+          <w:rFonts w:ascii="Consolas" w:hAnsi="Consolas"/>
+          <w:b w:val="0"/>
+          <w:sz w:val="19"/>
+        </w:rPr>
+        <w:t>Review</w:t>
+      </w:r>
+      <w:r>
+        <w:rPr>
+          <w:b w:val="0"/>
+        </w:rPr>
         <w:t xml:space="preserve"> e </w:t>
       </w:r>
       <w:r>
@@ -525,7 +545,7 @@
           <w:b w:val="0"/>
           <w:sz w:val="19"/>
         </w:rPr>
-        <w:t>Review</w:t>
+        <w:t>Cover</w:t>
       </w:r>
       <w:r>
         <w:rPr>
@@ -592,7 +612,7 @@
         <w:rPr>
           <w:b w:val="0"/>
         </w:rPr>
-        <w:t xml:space="preserve"> (V1 a V5). O Hibernate está configurado com </w:t>
+        <w:t xml:space="preserve"> (V1 a V6). O Hibernate está configurado com </w:t>
       </w:r>
       <w:r>
         <w:rPr>
@@ -1802,6 +1822,144 @@
                 <w:b w:val="0"/>
                 <w:sz w:val="19"/>
               </w:rPr>
+              <w:t>POST</w:t>
+            </w:r>
+          </w:p>
+        </w:tc>
+        <w:tc>
+          <w:tcPr>
+            <w:tcW w:type="dxa" w:w="2880"/>
+          </w:tcPr>
+          <w:p>
+            <w:pPr>
+              <w:spacing w:after="40"/>
+            </w:pPr>
+            <w:r>
+              <w:rPr>
+                <w:sz w:val="19"/>
+              </w:rPr>
+            </w:r>
+            <w:r>
+              <w:rPr>
+                <w:rFonts w:ascii="Consolas" w:hAnsi="Consolas"/>
+                <w:b w:val="0"/>
+                <w:sz w:val="19"/>
+              </w:rPr>
+              <w:t>/api/books/covers</w:t>
+            </w:r>
+          </w:p>
+        </w:tc>
+        <w:tc>
+          <w:tcPr>
+            <w:tcW w:type="dxa" w:w="2880"/>
+          </w:tcPr>
+          <w:p>
+            <w:pPr>
+              <w:spacing w:after="40"/>
+            </w:pPr>
+            <w:r>
+              <w:rPr>
+                <w:sz w:val="19"/>
+              </w:rPr>
+            </w:r>
+            <w:r>
+              <w:rPr>
+                <w:b w:val="0"/>
+                <w:sz w:val="19"/>
+              </w:rPr>
+              <w:t>ADMIN</w:t>
+            </w:r>
+          </w:p>
+        </w:tc>
+      </w:tr>
+      <w:tr>
+        <w:tc>
+          <w:tcPr>
+            <w:tcW w:type="dxa" w:w="2880"/>
+          </w:tcPr>
+          <w:p>
+            <w:pPr>
+              <w:spacing w:after="40"/>
+            </w:pPr>
+            <w:r>
+              <w:rPr>
+                <w:sz w:val="19"/>
+              </w:rPr>
+            </w:r>
+            <w:r>
+              <w:rPr>
+                <w:b w:val="0"/>
+                <w:sz w:val="19"/>
+              </w:rPr>
+              <w:t>GET</w:t>
+            </w:r>
+          </w:p>
+        </w:tc>
+        <w:tc>
+          <w:tcPr>
+            <w:tcW w:type="dxa" w:w="2880"/>
+          </w:tcPr>
+          <w:p>
+            <w:pPr>
+              <w:spacing w:after="40"/>
+            </w:pPr>
+            <w:r>
+              <w:rPr>
+                <w:sz w:val="19"/>
+              </w:rPr>
+            </w:r>
+            <w:r>
+              <w:rPr>
+                <w:rFonts w:ascii="Consolas" w:hAnsi="Consolas"/>
+                <w:b w:val="0"/>
+                <w:sz w:val="19"/>
+              </w:rPr>
+              <w:t>/api/books/covers/{id}</w:t>
+            </w:r>
+          </w:p>
+        </w:tc>
+        <w:tc>
+          <w:tcPr>
+            <w:tcW w:type="dxa" w:w="2880"/>
+          </w:tcPr>
+          <w:p>
+            <w:pPr>
+              <w:spacing w:after="40"/>
+            </w:pPr>
+            <w:r>
+              <w:rPr>
+                <w:sz w:val="19"/>
+              </w:rPr>
+            </w:r>
+            <w:r>
+              <w:rPr>
+                <w:b w:val="0"/>
+                <w:sz w:val="19"/>
+              </w:rPr>
+              <w:t>público</w:t>
+            </w:r>
+          </w:p>
+        </w:tc>
+      </w:tr>
+      <w:tr>
+        <w:tc>
+          <w:tcPr>
+            <w:tcW w:type="dxa" w:w="2880"/>
+          </w:tcPr>
+          <w:p>
+            <w:pPr>
+              <w:spacing w:after="40"/>
+            </w:pPr>
+            <w:r>
+              <w:rPr>
+                <w:sz w:val="19"/>
+              </w:rPr>
+            </w:r>
+            <w:r>
+              <w:rPr>
+                <w:b w:val="0"/>
+                <w:sz w:val="19"/>
+              </w:rPr>
               <w:t>GET</w:t>
             </w:r>
           </w:p>
@@ -2472,7 +2630,7 @@
         <w:rPr>
           <w:b w:val="0"/>
         </w:rPr>
-        <w:t>As três entidades do banco e os dois enums.</w:t>
+        <w:t>As quatro entidades do banco e os dois enums.</w:t>
       </w:r>
     </w:p>
     <w:p>
@@ -2482,7 +2640,7 @@
       <w:r>
         <w:drawing>
           <wp:inline xmlns:a="http://schemas.openxmlformats.org/drawingml/2006/main" xmlns:pic="http://schemas.openxmlformats.org/drawingml/2006/picture">
-            <wp:extent cx="5943600" cy="12972916"/>
+            <wp:extent cx="5943600" cy="10451765"/>
             <wp:docPr id="1" name="Picture 1"/>
             <wp:cNvGraphicFramePr>
               <a:graphicFrameLocks noChangeAspect="1"/>
@@ -2503,7 +2661,7 @@
                   <pic:spPr>
                     <a:xfrm>
                       <a:off x="0" y="0"/>
-                      <a:ext cx="5943600" cy="12972916"/>
+                      <a:ext cx="5943600" cy="10451765"/>
                     </a:xfrm>
                     <a:prstGeom prst="rect"/>
                   </pic:spPr>
@@ -2696,6 +2854,78 @@
           <w:b w:val="0"/>
         </w:rPr>
         <w:t>, que impede duas avaliações da mesma pessoa no mesmo livro.</w:t>
+      </w:r>
+    </w:p>
+    <w:p>
+      <w:r>
+        <w:rPr>
+          <w:rFonts w:ascii="Consolas" w:hAnsi="Consolas"/>
+          <w:b w:val="0"/>
+          <w:sz w:val="19"/>
+        </w:rPr>
+        <w:t>Cover</w:t>
+      </w:r>
+      <w:r>
+        <w:rPr>
+          <w:b w:val="0"/>
+        </w:rPr>
+        <w:t xml:space="preserve"> vira a tabela </w:t>
+      </w:r>
+      <w:r>
+        <w:rPr>
+          <w:rFonts w:ascii="Consolas" w:hAnsi="Consolas"/>
+          <w:b w:val="0"/>
+          <w:sz w:val="19"/>
+        </w:rPr>
+        <w:t>covers</w:t>
+      </w:r>
+      <w:r>
+        <w:rPr>
+          <w:b w:val="0"/>
+        </w:rPr>
+        <w:t xml:space="preserve"> e guarda a imagem de capa escolhida no formulário. O admin escolhe o arquivo no computador, o front envia para </w:t>
+      </w:r>
+      <w:r>
+        <w:rPr>
+          <w:rFonts w:ascii="Consolas" w:hAnsi="Consolas"/>
+          <w:b w:val="0"/>
+          <w:sz w:val="19"/>
+        </w:rPr>
+        <w:t>POST /api/books/covers</w:t>
+      </w:r>
+      <w:r>
+        <w:rPr>
+          <w:b w:val="0"/>
+        </w:rPr>
+        <w:t xml:space="preserve"> e recebe o endereço </w:t>
+      </w:r>
+      <w:r>
+        <w:rPr>
+          <w:rFonts w:ascii="Consolas" w:hAnsi="Consolas"/>
+          <w:b w:val="0"/>
+          <w:sz w:val="19"/>
+        </w:rPr>
+        <w:t>/api/books/covers/{id}</w:t>
+      </w:r>
+      <w:r>
+        <w:rPr>
+          <w:b w:val="0"/>
+        </w:rPr>
+        <w:t xml:space="preserve">, que vai para o </w:t>
+      </w:r>
+      <w:r>
+        <w:rPr>
+          <w:rFonts w:ascii="Consolas" w:hAnsi="Consolas"/>
+          <w:b w:val="0"/>
+          <w:sz w:val="19"/>
+        </w:rPr>
+        <w:t>coverUrl</w:t>
+      </w:r>
+      <w:r>
+        <w:rPr>
+          <w:b w:val="0"/>
+        </w:rPr>
+        <w:t xml:space="preserve"> do livro. A imagem fica no banco, e não numa pasta, porque o disco do Render é apagado a cada deploy. Só são aceitos JPG, PNG, WEBP e GIF de até 2 MB.</w:t>
       </w:r>
     </w:p>
     <w:p>

</xml_diff>